<commit_message>
changes in spec docs
</commit_message>
<xml_diff>
--- a/Backend_Specification_MPLADS.docx
+++ b/Backend_Specification_MPLADS.docx
@@ -27,7 +27,7 @@
           <w:sz w:val="26"/>
           <w:szCs w:val="26"/>
         </w:rPr>
-        <w:t xml:space="preserve">Aligned to System Design Rev. 2 (SIH26102)</w:t>
+        <w:t xml:space="preserve">Revision 2 — Supabase Architecture (aligned to System Design Rev. 3)</w:t>
       </w:r>
     </w:p>
     <w:p>
@@ -42,7 +42,7 @@
           <w:sz w:val="20"/>
           <w:szCs w:val="20"/>
         </w:rPr>
-        <w:t xml:space="preserve">This document uses the System Design Rev. 2 pipeline, five detection modules, and Risk/Impact/Priority, Compliance, Fund-Flow, Data-Quality, Inspection, and Audit layers as the authoritative backend contract. Terminology has been corrected from an earlier preliminary draft: “Vendor” is replaced with “Implementing Agency” throughout, since vendor-level payment data is not confirmed available in public MPLADS datasets.</w:t>
+        <w:t xml:space="preserve">This revision replaces the Spring Boot + Spring Security application layer with Supabase: hosted Postgres, auto-generated REST (PostgREST), Postgres RPC functions, Edge Functions for custom logic, Supabase Auth for authentication, and Row Level Security (RLS) for authorization. Detection engines, database schema, and the Risk/Impact/Priority model are unchanged from the prior revision. Terminology remains corrected: “Vendor” is “Implementing Agency” throughout.</w:t>
       </w:r>
     </w:p>
     <w:p>
@@ -259,7 +259,7 @@
           <w:szCs w:val="18"/>
         </w:rPr>
         <w:br/>
-        <w:t xml:space="preserve">  RISK / IMPACT / PRIORITY ENGINE</w:t>
+        <w:t xml:space="preserve">  RISK / IMPACT / PRIORITY ENGINE  (Python)</w:t>
       </w:r>
       <w:r>
         <w:rPr>
@@ -279,6 +279,96 @@
           <w:szCs w:val="18"/>
         </w:rPr>
         <w:br/>
+        <w:t xml:space="preserve">        v  (service-role write, bypasses RLS)</w:t>
+      </w:r>
+      <w:r>
+        <w:rPr>
+          <w:rFonts w:ascii="Consolas" w:cs="Consolas" w:eastAsia="Consolas" w:hAnsi="Consolas"/>
+          <w:color w:val="333333"/>
+          <w:sz w:val="18"/>
+          <w:szCs w:val="18"/>
+        </w:rPr>
+        <w:br/>
+        <w:t xml:space="preserve">  Supabase Postgres Database</w:t>
+      </w:r>
+      <w:r>
+        <w:rPr>
+          <w:rFonts w:ascii="Consolas" w:cs="Consolas" w:eastAsia="Consolas" w:hAnsi="Consolas"/>
+          <w:color w:val="333333"/>
+          <w:sz w:val="18"/>
+          <w:szCs w:val="18"/>
+        </w:rPr>
+        <w:br/>
+        <w:t xml:space="preserve">        |</w:t>
+      </w:r>
+      <w:r>
+        <w:rPr>
+          <w:rFonts w:ascii="Consolas" w:cs="Consolas" w:eastAsia="Consolas" w:hAnsi="Consolas"/>
+          <w:color w:val="333333"/>
+          <w:sz w:val="18"/>
+          <w:szCs w:val="18"/>
+        </w:rPr>
+        <w:br/>
+        <w:t xml:space="preserve">   +----+--------------------+</w:t>
+      </w:r>
+      <w:r>
+        <w:rPr>
+          <w:rFonts w:ascii="Consolas" w:cs="Consolas" w:eastAsia="Consolas" w:hAnsi="Consolas"/>
+          <w:color w:val="333333"/>
+          <w:sz w:val="18"/>
+          <w:szCs w:val="18"/>
+        </w:rPr>
+        <w:br/>
+        <w:t xml:space="preserve">   |                         |</w:t>
+      </w:r>
+      <w:r>
+        <w:rPr>
+          <w:rFonts w:ascii="Consolas" w:cs="Consolas" w:eastAsia="Consolas" w:hAnsi="Consolas"/>
+          <w:color w:val="333333"/>
+          <w:sz w:val="18"/>
+          <w:szCs w:val="18"/>
+        </w:rPr>
+        <w:br/>
+        <w:t xml:space="preserve">PostgREST auto-REST      Postgres RPC / Edge Functions</w:t>
+      </w:r>
+      <w:r>
+        <w:rPr>
+          <w:rFonts w:ascii="Consolas" w:cs="Consolas" w:eastAsia="Consolas" w:hAnsi="Consolas"/>
+          <w:color w:val="333333"/>
+          <w:sz w:val="18"/>
+          <w:szCs w:val="18"/>
+        </w:rPr>
+        <w:br/>
+        <w:t xml:space="preserve">   |                         |</w:t>
+      </w:r>
+      <w:r>
+        <w:rPr>
+          <w:rFonts w:ascii="Consolas" w:cs="Consolas" w:eastAsia="Consolas" w:hAnsi="Consolas"/>
+          <w:color w:val="333333"/>
+          <w:sz w:val="18"/>
+          <w:szCs w:val="18"/>
+        </w:rPr>
+        <w:br/>
+        <w:t xml:space="preserve">   +----+--------------------+</w:t>
+      </w:r>
+      <w:r>
+        <w:rPr>
+          <w:rFonts w:ascii="Consolas" w:cs="Consolas" w:eastAsia="Consolas" w:hAnsi="Consolas"/>
+          <w:color w:val="333333"/>
+          <w:sz w:val="18"/>
+          <w:szCs w:val="18"/>
+        </w:rPr>
+        <w:br/>
+        <w:t xml:space="preserve">        |</w:t>
+      </w:r>
+      <w:r>
+        <w:rPr>
+          <w:rFonts w:ascii="Consolas" w:cs="Consolas" w:eastAsia="Consolas" w:hAnsi="Consolas"/>
+          <w:color w:val="333333"/>
+          <w:sz w:val="18"/>
+          <w:szCs w:val="18"/>
+        </w:rPr>
+        <w:br/>
         <w:t xml:space="preserve">        v</w:t>
       </w:r>
       <w:r>
@@ -289,7 +379,7 @@
           <w:szCs w:val="18"/>
         </w:rPr>
         <w:br/>
-        <w:t xml:space="preserve">  PostgreSQL Database</w:t>
+        <w:t xml:space="preserve">  Supabase Auth  +  Row Level Security (per-request)</w:t>
       </w:r>
       <w:r>
         <w:rPr>
@@ -319,7 +409,7 @@
           <w:szCs w:val="18"/>
         </w:rPr>
         <w:br/>
-        <w:t xml:space="preserve">  Spring Boot REST API  +  Spring Security / RBAC</w:t>
+        <w:t xml:space="preserve">  React Frontend (supabase-js)</w:t>
       </w:r>
       <w:r>
         <w:rPr>
@@ -349,37 +439,7 @@
           <w:szCs w:val="18"/>
         </w:rPr>
         <w:br/>
-        <w:t xml:space="preserve">  React Frontend</w:t>
-      </w:r>
-      <w:r>
-        <w:rPr>
-          <w:rFonts w:ascii="Consolas" w:cs="Consolas" w:eastAsia="Consolas" w:hAnsi="Consolas"/>
-          <w:color w:val="333333"/>
-          <w:sz w:val="18"/>
-          <w:szCs w:val="18"/>
-        </w:rPr>
-        <w:br/>
-        <w:t xml:space="preserve">        |</w:t>
-      </w:r>
-      <w:r>
-        <w:rPr>
-          <w:rFonts w:ascii="Consolas" w:cs="Consolas" w:eastAsia="Consolas" w:hAnsi="Consolas"/>
-          <w:color w:val="333333"/>
-          <w:sz w:val="18"/>
-          <w:szCs w:val="18"/>
-        </w:rPr>
-        <w:br/>
-        <w:t xml:space="preserve">        v</w:t>
-      </w:r>
-      <w:r>
-        <w:rPr>
-          <w:rFonts w:ascii="Consolas" w:cs="Consolas" w:eastAsia="Consolas" w:hAnsi="Consolas"/>
-          <w:color w:val="333333"/>
-          <w:sz w:val="18"/>
-          <w:szCs w:val="18"/>
-        </w:rPr>
-        <w:br/>
-        <w:t xml:space="preserve">  INSPECTION / REVIEW  -&gt;  AUDIT LOG</w:t>
+        <w:t xml:space="preserve">  INSPECTION / REVIEW  -&gt;  AUDIT LOG (Postgres triggers)</w:t>
       </w:r>
     </w:p>
     <w:p>
@@ -394,7 +454,7 @@
           <w:sz w:val="20"/>
           <w:szCs w:val="20"/>
         </w:rPr>
-        <w:t xml:space="preserve">Aggregation (Agency / District / State / MP) runs alongside Fund Flow and Compliance and feeds the same Risk / Impact / Priority Engine.</w:t>
+        <w:t xml:space="preserve">There is no custom Java application server. The database is the API: PostgREST exposes tables/views directly, RPC functions and Edge Functions cover composite reads and writes, and RLS policies replace service-layer authorization checks.</w:t>
       </w:r>
     </w:p>
     <w:p>
@@ -673,7 +733,7 @@
                 <w:sz w:val="19"/>
                 <w:szCs w:val="19"/>
               </w:rPr>
-              <w:t xml:space="preserve">PostgreSQL</w:t>
+              <w:t xml:space="preserve">Supabase Postgres (managed)</w:t>
             </w:r>
           </w:p>
         </w:tc>
@@ -698,7 +758,7 @@
                 <w:sz w:val="19"/>
                 <w:szCs w:val="19"/>
               </w:rPr>
-              <w:t xml:space="preserve">Backend</w:t>
+              <w:t xml:space="preserve">Authentication</w:t>
             </w:r>
           </w:p>
         </w:tc>
@@ -721,7 +781,7 @@
                 <w:sz w:val="19"/>
                 <w:szCs w:val="19"/>
               </w:rPr>
-              <w:t xml:space="preserve">Spring Boot</w:t>
+              <w:t xml:space="preserve">Supabase Auth (JWT)</w:t>
             </w:r>
           </w:p>
         </w:tc>
@@ -747,7 +807,7 @@
                 <w:sz w:val="19"/>
                 <w:szCs w:val="19"/>
               </w:rPr>
-              <w:t xml:space="preserve">Security</w:t>
+              <w:t xml:space="preserve">Authorization</w:t>
             </w:r>
           </w:p>
         </w:tc>
@@ -771,7 +831,7 @@
                 <w:sz w:val="19"/>
                 <w:szCs w:val="19"/>
               </w:rPr>
-              <w:t xml:space="preserve">Spring Security</w:t>
+              <w:t xml:space="preserve">Postgres Row Level Security (RLS)</w:t>
             </w:r>
           </w:p>
         </w:tc>
@@ -796,7 +856,7 @@
                 <w:sz w:val="19"/>
                 <w:szCs w:val="19"/>
               </w:rPr>
-              <w:t xml:space="preserve">Frontend</w:t>
+              <w:t xml:space="preserve">API layer</w:t>
             </w:r>
           </w:p>
         </w:tc>
@@ -819,7 +879,7 @@
                 <w:sz w:val="19"/>
                 <w:szCs w:val="19"/>
               </w:rPr>
-              <w:t xml:space="preserve">React</w:t>
+              <w:t xml:space="preserve">PostgREST (auto-REST) + Postgres RPC functions + Edge Functions (Deno/TypeScript)</w:t>
             </w:r>
           </w:p>
         </w:tc>
@@ -845,7 +905,7 @@
                 <w:sz w:val="19"/>
                 <w:szCs w:val="19"/>
               </w:rPr>
-              <w:t xml:space="preserve">Deployment</w:t>
+              <w:t xml:space="preserve">File storage</w:t>
             </w:r>
           </w:p>
         </w:tc>
@@ -869,7 +929,105 @@
                 <w:sz w:val="19"/>
                 <w:szCs w:val="19"/>
               </w:rPr>
-              <w:t xml:space="preserve">Docker / cloud VM (optional for MVP)</w:t>
+              <w:t xml:space="preserve">Supabase Storage (inspection evidence)</w:t>
+            </w:r>
+          </w:p>
+        </w:tc>
+      </w:tr>
+      <w:tr>
+        <w:tc>
+          <w:tcPr>
+            <w:tcW w:type="dxa" w:w="3600"/>
+            <w:tcMar>
+              <w:top w:type="dxa" w:w="80"/>
+              <w:left w:type="dxa" w:w="100"/>
+              <w:bottom w:type="dxa" w:w="80"/>
+              <w:right w:type="dxa" w:w="100"/>
+            </w:tcMar>
+          </w:tcPr>
+          <w:p>
+            <w:r>
+              <w:rPr>
+                <w:b w:val="false"/>
+                <w:bCs w:val="false"/>
+                <w:color w:val="222222"/>
+                <w:sz w:val="19"/>
+                <w:szCs w:val="19"/>
+              </w:rPr>
+              <w:t xml:space="preserve">Frontend</w:t>
+            </w:r>
+          </w:p>
+        </w:tc>
+        <w:tc>
+          <w:tcPr>
+            <w:tcW w:type="dxa" w:w="6300"/>
+            <w:tcMar>
+              <w:top w:type="dxa" w:w="80"/>
+              <w:left w:type="dxa" w:w="100"/>
+              <w:bottom w:type="dxa" w:w="80"/>
+              <w:right w:type="dxa" w:w="100"/>
+            </w:tcMar>
+          </w:tcPr>
+          <w:p>
+            <w:r>
+              <w:rPr>
+                <w:b w:val="false"/>
+                <w:bCs w:val="false"/>
+                <w:color w:val="222222"/>
+                <w:sz w:val="19"/>
+                <w:szCs w:val="19"/>
+              </w:rPr>
+              <w:t xml:space="preserve">React + supabase-js</w:t>
+            </w:r>
+          </w:p>
+        </w:tc>
+      </w:tr>
+      <w:tr>
+        <w:tc>
+          <w:tcPr>
+            <w:tcW w:type="dxa" w:w="3600"/>
+            <w:shd w:fill="EDF1F7" w:val="clear"/>
+            <w:tcMar>
+              <w:top w:type="dxa" w:w="80"/>
+              <w:left w:type="dxa" w:w="100"/>
+              <w:bottom w:type="dxa" w:w="80"/>
+              <w:right w:type="dxa" w:w="100"/>
+            </w:tcMar>
+          </w:tcPr>
+          <w:p>
+            <w:r>
+              <w:rPr>
+                <w:b w:val="false"/>
+                <w:bCs w:val="false"/>
+                <w:color w:val="222222"/>
+                <w:sz w:val="19"/>
+                <w:szCs w:val="19"/>
+              </w:rPr>
+              <w:t xml:space="preserve">Deployment</w:t>
+            </w:r>
+          </w:p>
+        </w:tc>
+        <w:tc>
+          <w:tcPr>
+            <w:tcW w:type="dxa" w:w="6300"/>
+            <w:shd w:fill="EDF1F7" w:val="clear"/>
+            <w:tcMar>
+              <w:top w:type="dxa" w:w="80"/>
+              <w:left w:type="dxa" w:w="100"/>
+              <w:bottom w:type="dxa" w:w="80"/>
+              <w:right w:type="dxa" w:w="100"/>
+            </w:tcMar>
+          </w:tcPr>
+          <w:p>
+            <w:r>
+              <w:rPr>
+                <w:b w:val="false"/>
+                <w:bCs w:val="false"/>
+                <w:color w:val="222222"/>
+                <w:sz w:val="19"/>
+                <w:szCs w:val="19"/>
+              </w:rPr>
+              <w:t xml:space="preserve">Supabase-hosted backend; static hosting for React (e.g. Vercel/Netlify)</w:t>
             </w:r>
           </w:p>
         </w:tc>
@@ -883,11 +1041,11 @@
         <w:rPr>
           <w:b/>
           <w:bCs/>
-          <w:color w:val="1D6B33"/>
+          <w:color w:val="B00020"/>
           <w:sz w:val="19"/>
           <w:szCs w:val="19"/>
         </w:rPr>
-        <w:t xml:space="preserve">Locked by System Design Rev. 2 — do not substitute FastAPI or Node.js for the API layer.</w:t>
+        <w:t xml:space="preserve">Spring Boot and Spring Security are removed from the stack as of this revision.</w:t>
       </w:r>
     </w:p>
     <w:p>
@@ -902,7 +1060,7 @@
           <w:sz w:val="20"/>
           <w:szCs w:val="20"/>
         </w:rPr>
-        <w:t xml:space="preserve">Python remains the data/ML layer; Spring Boot is the application/API layer.</w:t>
+        <w:t xml:space="preserve">Python remains the data/ML layer, writing results into Supabase Postgres using the service-role key from a trusted server-side/batch context only.</w:t>
       </w:r>
     </w:p>
     <w:p>
@@ -918,7 +1076,7 @@
           <w:sz w:val="30"/>
           <w:szCs w:val="30"/>
         </w:rPr>
-        <w:t xml:space="preserve">3. Backend Module Layout</w:t>
+        <w:t xml:space="preserve">3. Project Layout</w:t>
       </w:r>
     </w:p>
     <w:p>
@@ -934,7 +1092,7 @@
           <w:sz w:val="22"/>
           <w:szCs w:val="22"/>
         </w:rPr>
-        <w:t xml:space="preserve">Spring Boot (backend/)</w:t>
+        <w:t xml:space="preserve">Supabase project (supabase/)</w:t>
       </w:r>
     </w:p>
     <w:p>
@@ -955,37 +1113,137 @@
           <w:sz w:val="18"/>
           <w:szCs w:val="18"/>
         </w:rPr>
-        <w:t xml:space="preserve">auth/         users/        dashboard/     risk/</w:t>
-      </w:r>
-      <w:r>
-        <w:rPr>
-          <w:rFonts w:ascii="Consolas" w:cs="Consolas" w:eastAsia="Consolas" w:hAnsi="Consolas"/>
-          <w:color w:val="333333"/>
-          <w:sz w:val="18"/>
-          <w:szCs w:val="18"/>
-        </w:rPr>
-        <w:br/>
-        <w:t xml:space="preserve">cost/         duplicate/    delay/         fund-flow/</w:t>
-      </w:r>
-      <w:r>
-        <w:rPr>
-          <w:rFonts w:ascii="Consolas" w:cs="Consolas" w:eastAsia="Consolas" w:hAnsi="Consolas"/>
-          <w:color w:val="333333"/>
-          <w:sz w:val="18"/>
-          <w:szCs w:val="18"/>
-        </w:rPr>
-        <w:br/>
-        <w:t xml:space="preserve">compliance/   inspections/  data-quality/  analytics/</w:t>
-      </w:r>
-      <w:r>
-        <w:rPr>
-          <w:rFonts w:ascii="Consolas" w:cs="Consolas" w:eastAsia="Consolas" w:hAnsi="Consolas"/>
-          <w:color w:val="333333"/>
-          <w:sz w:val="18"/>
-          <w:szCs w:val="18"/>
-        </w:rPr>
-        <w:br/>
-        <w:t xml:space="preserve">audit/        settings/     reports/       works/</w:t>
+        <w:t xml:space="preserve">supabase/</w:t>
+      </w:r>
+      <w:r>
+        <w:rPr>
+          <w:rFonts w:ascii="Consolas" w:cs="Consolas" w:eastAsia="Consolas" w:hAnsi="Consolas"/>
+          <w:color w:val="333333"/>
+          <w:sz w:val="18"/>
+          <w:szCs w:val="18"/>
+        </w:rPr>
+        <w:br/>
+        <w:t xml:space="preserve">  migrations/           -- SQL migrations: tables, views, RLS policies, triggers</w:t>
+      </w:r>
+      <w:r>
+        <w:rPr>
+          <w:rFonts w:ascii="Consolas" w:cs="Consolas" w:eastAsia="Consolas" w:hAnsi="Consolas"/>
+          <w:color w:val="333333"/>
+          <w:sz w:val="18"/>
+          <w:szCs w:val="18"/>
+        </w:rPr>
+        <w:br/>
+        <w:t xml:space="preserve">    0001_init.sql</w:t>
+      </w:r>
+      <w:r>
+        <w:rPr>
+          <w:rFonts w:ascii="Consolas" w:cs="Consolas" w:eastAsia="Consolas" w:hAnsi="Consolas"/>
+          <w:color w:val="333333"/>
+          <w:sz w:val="18"/>
+          <w:szCs w:val="18"/>
+        </w:rPr>
+        <w:br/>
+        <w:t xml:space="preserve">    0002_detection_and_risk.sql</w:t>
+      </w:r>
+      <w:r>
+        <w:rPr>
+          <w:rFonts w:ascii="Consolas" w:cs="Consolas" w:eastAsia="Consolas" w:hAnsi="Consolas"/>
+          <w:color w:val="333333"/>
+          <w:sz w:val="18"/>
+          <w:szCs w:val="18"/>
+        </w:rPr>
+        <w:br/>
+        <w:t xml:space="preserve">    0003_compliance_and_fundflow.sql</w:t>
+      </w:r>
+      <w:r>
+        <w:rPr>
+          <w:rFonts w:ascii="Consolas" w:cs="Consolas" w:eastAsia="Consolas" w:hAnsi="Consolas"/>
+          <w:color w:val="333333"/>
+          <w:sz w:val="18"/>
+          <w:szCs w:val="18"/>
+        </w:rPr>
+        <w:br/>
+        <w:t xml:space="preserve">    0004_inspections_and_audit.sql</w:t>
+      </w:r>
+      <w:r>
+        <w:rPr>
+          <w:rFonts w:ascii="Consolas" w:cs="Consolas" w:eastAsia="Consolas" w:hAnsi="Consolas"/>
+          <w:color w:val="333333"/>
+          <w:sz w:val="18"/>
+          <w:szCs w:val="18"/>
+        </w:rPr>
+        <w:br/>
+        <w:t xml:space="preserve">    0005_rls_policies.sql</w:t>
+      </w:r>
+      <w:r>
+        <w:rPr>
+          <w:rFonts w:ascii="Consolas" w:cs="Consolas" w:eastAsia="Consolas" w:hAnsi="Consolas"/>
+          <w:color w:val="333333"/>
+          <w:sz w:val="18"/>
+          <w:szCs w:val="18"/>
+        </w:rPr>
+        <w:br/>
+        <w:t xml:space="preserve">  functions/            -- Edge Functions (Deno/TypeScript)</w:t>
+      </w:r>
+      <w:r>
+        <w:rPr>
+          <w:rFonts w:ascii="Consolas" w:cs="Consolas" w:eastAsia="Consolas" w:hAnsi="Consolas"/>
+          <w:color w:val="333333"/>
+          <w:sz w:val="18"/>
+          <w:szCs w:val="18"/>
+        </w:rPr>
+        <w:br/>
+        <w:t xml:space="preserve">    work-detail/        -- composite Work Detail payload</w:t>
+      </w:r>
+      <w:r>
+        <w:rPr>
+          <w:rFonts w:ascii="Consolas" w:cs="Consolas" w:eastAsia="Consolas" w:hAnsi="Consolas"/>
+          <w:color w:val="333333"/>
+          <w:sz w:val="18"/>
+          <w:szCs w:val="18"/>
+        </w:rPr>
+        <w:br/>
+        <w:t xml:space="preserve">    inspection-priority/</w:t>
+      </w:r>
+      <w:r>
+        <w:rPr>
+          <w:rFonts w:ascii="Consolas" w:cs="Consolas" w:eastAsia="Consolas" w:hAnsi="Consolas"/>
+          <w:color w:val="333333"/>
+          <w:sz w:val="18"/>
+          <w:szCs w:val="18"/>
+        </w:rPr>
+        <w:br/>
+        <w:t xml:space="preserve">    risk-weights-update/</w:t>
+      </w:r>
+      <w:r>
+        <w:rPr>
+          <w:rFonts w:ascii="Consolas" w:cs="Consolas" w:eastAsia="Consolas" w:hAnsi="Consolas"/>
+          <w:color w:val="333333"/>
+          <w:sz w:val="18"/>
+          <w:szCs w:val="18"/>
+        </w:rPr>
+        <w:br/>
+        <w:t xml:space="preserve">    review-decision/</w:t>
+      </w:r>
+      <w:r>
+        <w:rPr>
+          <w:rFonts w:ascii="Consolas" w:cs="Consolas" w:eastAsia="Consolas" w:hAnsi="Consolas"/>
+          <w:color w:val="333333"/>
+          <w:sz w:val="18"/>
+          <w:szCs w:val="18"/>
+        </w:rPr>
+        <w:br/>
+        <w:t xml:space="preserve">    data-quality-summary/</w:t>
+      </w:r>
+      <w:r>
+        <w:rPr>
+          <w:rFonts w:ascii="Consolas" w:cs="Consolas" w:eastAsia="Consolas" w:hAnsi="Consolas"/>
+          <w:color w:val="333333"/>
+          <w:sz w:val="18"/>
+          <w:szCs w:val="18"/>
+        </w:rPr>
+        <w:br/>
+        <w:t xml:space="preserve">  seed.sql</w:t>
       </w:r>
     </w:p>
     <w:p>
@@ -1022,51 +1280,47 @@
           <w:sz w:val="18"/>
           <w:szCs w:val="18"/>
         </w:rPr>
-        <w:t xml:space="preserve">ingestion/  preprocessing/  features/</w:t>
-      </w:r>
-      <w:r>
-        <w:rPr>
-          <w:rFonts w:ascii="Consolas" w:cs="Consolas" w:eastAsia="Consolas" w:hAnsi="Consolas"/>
-          <w:color w:val="333333"/>
-          <w:sz w:val="18"/>
-          <w:szCs w:val="18"/>
-        </w:rPr>
-        <w:br/>
-        <w:t xml:space="preserve">cost_anomaly/  duplicate_detection/  delay_detection/</w:t>
-      </w:r>
-      <w:r>
-        <w:rPr>
-          <w:rFonts w:ascii="Consolas" w:cs="Consolas" w:eastAsia="Consolas" w:hAnsi="Consolas"/>
-          <w:color w:val="333333"/>
-          <w:sz w:val="18"/>
-          <w:szCs w:val="18"/>
-        </w:rPr>
-        <w:br/>
-        <w:t xml:space="preserve">fund_flow/  evaluation/</w:t>
-      </w:r>
-    </w:p>
-    <w:p>
-      <w:pPr>
-        <w:pStyle w:val="Heading1"/>
-        <w:spacing w:after="160" w:before="360"/>
-      </w:pPr>
-      <w:r>
-        <w:rPr>
-          <w:b/>
-          <w:bCs/>
-          <w:color w:val="1F3864"/>
-          <w:sz w:val="30"/>
-          <w:szCs w:val="30"/>
-        </w:rPr>
-        <w:t xml:space="preserve">4. Database Design</w:t>
-      </w:r>
-    </w:p>
-    <w:p>
-      <w:pPr>
-        <w:spacing w:after="120"/>
-      </w:pPr>
-      <w:r>
-        <w:t xml:space="preserve">Primary tables specified by System Design Rev. 2: works, fund_releases, work_progress, users, detection_results, risk_scores, compliance_rules, compliance_flags, duplicate_candidates, fund_anomalies, data_quality_results, inspections, and audit_log.</w:t>
+        <w:t xml:space="preserve">ml/</w:t>
+      </w:r>
+      <w:r>
+        <w:rPr>
+          <w:rFonts w:ascii="Consolas" w:cs="Consolas" w:eastAsia="Consolas" w:hAnsi="Consolas"/>
+          <w:color w:val="333333"/>
+          <w:sz w:val="18"/>
+          <w:szCs w:val="18"/>
+        </w:rPr>
+        <w:br/>
+        <w:t xml:space="preserve">  ingestion/  preprocessing/  features/</w:t>
+      </w:r>
+      <w:r>
+        <w:rPr>
+          <w:rFonts w:ascii="Consolas" w:cs="Consolas" w:eastAsia="Consolas" w:hAnsi="Consolas"/>
+          <w:color w:val="333333"/>
+          <w:sz w:val="18"/>
+          <w:szCs w:val="18"/>
+        </w:rPr>
+        <w:br/>
+        <w:t xml:space="preserve">  cost_anomaly/  duplicate_detection/  delay_detection/</w:t>
+      </w:r>
+      <w:r>
+        <w:rPr>
+          <w:rFonts w:ascii="Consolas" w:cs="Consolas" w:eastAsia="Consolas" w:hAnsi="Consolas"/>
+          <w:color w:val="333333"/>
+          <w:sz w:val="18"/>
+          <w:szCs w:val="18"/>
+        </w:rPr>
+        <w:br/>
+        <w:t xml:space="preserve">  fund_flow/  compliance/  risk_engine/  evaluation/</w:t>
+      </w:r>
+      <w:r>
+        <w:rPr>
+          <w:rFonts w:ascii="Consolas" w:cs="Consolas" w:eastAsia="Consolas" w:hAnsi="Consolas"/>
+          <w:color w:val="333333"/>
+          <w:sz w:val="18"/>
+          <w:szCs w:val="18"/>
+        </w:rPr>
+        <w:br/>
+        <w:t xml:space="preserve">  supabase_client.py   -- service-role connection, batch upserts</w:t>
       </w:r>
     </w:p>
     <w:p>
@@ -1082,446 +1336,7 @@
           <w:sz w:val="22"/>
           <w:szCs w:val="22"/>
         </w:rPr>
-        <w:t xml:space="preserve">4.1 works — central table</w:t>
-      </w:r>
-    </w:p>
-    <w:p>
-      <w:pPr>
-        <w:pStyle w:val="ListParagraph"/>
-        <w:numPr>
-          <w:ilvl w:val="0"/>
-          <w:numId w:val="2"/>
-        </w:numPr>
-        <w:spacing w:after="60"/>
-      </w:pPr>
-      <w:r>
-        <w:t xml:space="preserve">id, unique_work_number, work_name, work_category</w:t>
-      </w:r>
-    </w:p>
-    <w:p>
-      <w:pPr>
-        <w:pStyle w:val="ListParagraph"/>
-        <w:numPr>
-          <w:ilvl w:val="0"/>
-          <w:numId w:val="2"/>
-        </w:numPr>
-        <w:spacing w:after="60"/>
-      </w:pPr>
-      <w:r>
-        <w:t xml:space="preserve">state, implementing_district, nodal_district</w:t>
-      </w:r>
-    </w:p>
-    <w:p>
-      <w:pPr>
-        <w:pStyle w:val="ListParagraph"/>
-        <w:numPr>
-          <w:ilvl w:val="0"/>
-          <w:numId w:val="2"/>
-        </w:numPr>
-        <w:spacing w:after="60"/>
-      </w:pPr>
-      <w:r>
-        <w:t xml:space="preserve">mp_id, house_name, implementing_agency_id</w:t>
-      </w:r>
-    </w:p>
-    <w:p>
-      <w:pPr>
-        <w:pStyle w:val="ListParagraph"/>
-        <w:numPr>
-          <w:ilvl w:val="0"/>
-          <w:numId w:val="2"/>
-        </w:numPr>
-        <w:spacing w:after="60"/>
-      </w:pPr>
-      <w:r>
-        <w:t xml:space="preserve">sanction_amount, actual_expenditure, released_amount</w:t>
-      </w:r>
-    </w:p>
-    <w:p>
-      <w:pPr>
-        <w:pStyle w:val="ListParagraph"/>
-        <w:numPr>
-          <w:ilvl w:val="0"/>
-          <w:numId w:val="2"/>
-        </w:numPr>
-        <w:spacing w:after="60"/>
-      </w:pPr>
-      <w:r>
-        <w:t xml:space="preserve">recommendation_date, administrative_approval_date, sanction_date, commencement_date, latest_progress_date, completion_date, final_payment_date, completion_marking_date, handover_date</w:t>
-      </w:r>
-    </w:p>
-    <w:p>
-      <w:pPr>
-        <w:pStyle w:val="ListParagraph"/>
-        <w:numPr>
-          <w:ilvl w:val="0"/>
-          <w:numId w:val="2"/>
-        </w:numPr>
-        <w:spacing w:after="60"/>
-      </w:pPr>
-      <w:r>
-        <w:t xml:space="preserve">work_status, financial_year, latitude, longitude</w:t>
-      </w:r>
-    </w:p>
-    <w:p>
-      <w:pPr>
-        <w:pStyle w:val="ListParagraph"/>
-        <w:numPr>
-          <w:ilvl w:val="0"/>
-          <w:numId w:val="2"/>
-        </w:numPr>
-        <w:spacing w:after="60"/>
-      </w:pPr>
-      <w:r>
-        <w:t xml:space="preserve">data_confidence, created_at, updated_at</w:t>
-      </w:r>
-    </w:p>
-    <w:p>
-      <w:pPr>
-        <w:spacing w:after="120"/>
-      </w:pPr>
-      <w:r>
-        <w:rPr>
-          <w:i/>
-          <w:iCs/>
-          <w:color w:val="666666"/>
-          <w:sz w:val="20"/>
-          <w:szCs w:val="20"/>
-        </w:rPr>
-        <w:t xml:space="preserve">unique_work_number is the primary external identifier for integration and duplicate checks.</w:t>
-      </w:r>
-    </w:p>
-    <w:p>
-      <w:pPr>
-        <w:pStyle w:val="Heading3"/>
-        <w:spacing w:after="100" w:before="200"/>
-      </w:pPr>
-      <w:r>
-        <w:rPr>
-          <w:b/>
-          <w:bCs/>
-          <w:color w:val="1F3864"/>
-          <w:sz w:val="22"/>
-          <w:szCs w:val="22"/>
-        </w:rPr>
-        <w:t xml:space="preserve">4.2 fund_releases</w:t>
-      </w:r>
-    </w:p>
-    <w:p>
-      <w:pPr>
-        <w:pStyle w:val="ListParagraph"/>
-        <w:numPr>
-          <w:ilvl w:val="0"/>
-          <w:numId w:val="2"/>
-        </w:numPr>
-        <w:spacing w:after="60"/>
-      </w:pPr>
-      <w:r>
-        <w:t xml:space="preserve">id, work_id (FK), installment_number, amount, release_date, transaction_type, source_reference, created_at</w:t>
-      </w:r>
-    </w:p>
-    <w:p>
-      <w:pPr>
-        <w:spacing w:after="120"/>
-      </w:pPr>
-      <w:r>
-        <w:rPr>
-          <w:i/>
-          <w:iCs/>
-          <w:color w:val="666666"/>
-          <w:sz w:val="20"/>
-          <w:szCs w:val="20"/>
-        </w:rPr>
-        <w:t xml:space="preserve">Kept as a proper child table (not a JSON blob) so the Fund Flow timeline can be built directly from rows, since Fund Flow is a core engine, not a side feature.</w:t>
-      </w:r>
-    </w:p>
-    <w:p>
-      <w:pPr>
-        <w:pStyle w:val="Heading3"/>
-        <w:spacing w:after="100" w:before="200"/>
-      </w:pPr>
-      <w:r>
-        <w:rPr>
-          <w:b/>
-          <w:bCs/>
-          <w:color w:val="1F3864"/>
-          <w:sz w:val="22"/>
-          <w:szCs w:val="22"/>
-        </w:rPr>
-        <w:t xml:space="preserve">4.3 work_progress</w:t>
-      </w:r>
-    </w:p>
-    <w:p>
-      <w:pPr>
-        <w:pStyle w:val="ListParagraph"/>
-        <w:numPr>
-          <w:ilvl w:val="0"/>
-          <w:numId w:val="2"/>
-        </w:numPr>
-        <w:spacing w:after="60"/>
-      </w:pPr>
-      <w:r>
-        <w:t xml:space="preserve">id, work_id, progress_date, physical_progress, financial_progress, work_status, remarks, source_reference, created_at</w:t>
-      </w:r>
-    </w:p>
-    <w:p>
-      <w:pPr>
-        <w:spacing w:after="120"/>
-      </w:pPr>
-      <w:r>
-        <w:t xml:space="preserve">Both progress fields are nullable. A missing value is stored as null with data_available: false, never assumed to be 0 — physical-progress and payment-to-work-item data are known to be incomplete in public MPLADS data.</w:t>
-      </w:r>
-    </w:p>
-    <w:p>
-      <w:pPr>
-        <w:pStyle w:val="Heading3"/>
-        <w:spacing w:after="100" w:before="200"/>
-      </w:pPr>
-      <w:r>
-        <w:rPr>
-          <w:b/>
-          <w:bCs/>
-          <w:color w:val="1F3864"/>
-          <w:sz w:val="22"/>
-          <w:szCs w:val="22"/>
-        </w:rPr>
-        <w:t xml:space="preserve">4.4 users</w:t>
-      </w:r>
-    </w:p>
-    <w:p>
-      <w:pPr>
-        <w:pStyle w:val="ListParagraph"/>
-        <w:numPr>
-          <w:ilvl w:val="0"/>
-          <w:numId w:val="2"/>
-        </w:numPr>
-        <w:spacing w:after="60"/>
-      </w:pPr>
-      <w:r>
-        <w:t xml:space="preserve">user_id, name, email, password_hash, role, constituency_id, district_id, state_id, active, created_at, updated_at</w:t>
-      </w:r>
-    </w:p>
-    <w:p>
-      <w:pPr>
-        <w:pStyle w:val="ListParagraph"/>
-        <w:numPr>
-          <w:ilvl w:val="0"/>
-          <w:numId w:val="2"/>
-        </w:numPr>
-        <w:spacing w:after="60"/>
-      </w:pPr>
-      <w:r>
-        <w:t xml:space="preserve">Roles: MP, district_officer, state_admin, mospi_admin</w:t>
-      </w:r>
-    </w:p>
-    <w:p>
-      <w:pPr>
-        <w:pStyle w:val="Heading3"/>
-        <w:spacing w:after="100" w:before="200"/>
-      </w:pPr>
-      <w:r>
-        <w:rPr>
-          <w:b/>
-          <w:bCs/>
-          <w:color w:val="1F3864"/>
-          <w:sz w:val="22"/>
-          <w:szCs w:val="22"/>
-        </w:rPr>
-        <w:t xml:space="preserve">4.5 data_quality_results</w:t>
-      </w:r>
-    </w:p>
-    <w:p>
-      <w:pPr>
-        <w:pStyle w:val="ListParagraph"/>
-        <w:numPr>
-          <w:ilvl w:val="0"/>
-          <w:numId w:val="2"/>
-        </w:numPr>
-        <w:spacing w:after="60"/>
-      </w:pPr>
-      <w:r>
-        <w:t xml:space="preserve">id, work_id, field_name, issue_type, severity, message, created_at</w:t>
-      </w:r>
-    </w:p>
-    <w:p>
-      <w:pPr>
-        <w:pStyle w:val="ListParagraph"/>
-        <w:numPr>
-          <w:ilvl w:val="0"/>
-          <w:numId w:val="2"/>
-        </w:numPr>
-        <w:spacing w:after="60"/>
-      </w:pPr>
-      <w:r>
-        <w:t xml:space="preserve">issue_type values: MISSING_FIELD, INVALID_DATE, INVALID_AMOUNT, INVALID_STATUS, INVALID_DISTRICT, INVALID_AGENCY, DUPLICATE_WORK_ID, INCONSISTENT_DATA</w:t>
-      </w:r>
-    </w:p>
-    <w:p>
-      <w:pPr>
-        <w:spacing w:after="120"/>
-      </w:pPr>
-      <w:r>
-        <w:t xml:space="default"/>
-      </w:r>
-    </w:p>
-    <w:p>
-      <w:pPr>
-        <w:pStyle w:val="Heading3"/>
-        <w:spacing w:after="100" w:before="200"/>
-      </w:pPr>
-      <w:r>
-        <w:rPr>
-          <w:b/>
-          <w:bCs/>
-          <w:color w:val="1F3864"/>
-          <w:sz w:val="22"/>
-          <w:szCs w:val="22"/>
-        </w:rPr>
-        <w:t xml:space="preserve">4.6 work_features</w:t>
-      </w:r>
-    </w:p>
-    <w:p>
-      <w:pPr>
-        <w:pStyle w:val="ListParagraph"/>
-        <w:numPr>
-          <w:ilvl w:val="0"/>
-          <w:numId w:val="2"/>
-        </w:numPr>
-        <w:spacing w:after="60"/>
-      </w:pPr>
-      <w:r>
-        <w:t xml:space="preserve">work_id, cost_peer_median, cost_peer_mad, cost_deviation, project_age_days</w:t>
-      </w:r>
-    </w:p>
-    <w:p>
-      <w:pPr>
-        <w:pStyle w:val="ListParagraph"/>
-        <w:numPr>
-          <w:ilvl w:val="0"/>
-          <w:numId w:val="2"/>
-        </w:numPr>
-        <w:spacing w:after="60"/>
-      </w:pPr>
-      <w:r>
-        <w:t xml:space="preserve">sanction_delay_days, start_delay_days, execution_delay_days, payment_delay_days, closure_delay_days</w:t>
-      </w:r>
-    </w:p>
-    <w:p>
-      <w:pPr>
-        <w:pStyle w:val="ListParagraph"/>
-        <w:numPr>
-          <w:ilvl w:val="0"/>
-          <w:numId w:val="2"/>
-        </w:numPr>
-        <w:spacing w:after="60"/>
-      </w:pPr>
-      <w:r>
-        <w:t xml:space="preserve">released_percentage, expenditure_percentage, duplicate_text_similarity</w:t>
-      </w:r>
-    </w:p>
-    <w:p>
-      <w:pPr>
-        <w:pStyle w:val="ListParagraph"/>
-        <w:numPr>
-          <w:ilvl w:val="0"/>
-          <w:numId w:val="2"/>
-        </w:numPr>
-        <w:spacing w:after="60"/>
-      </w:pPr>
-      <w:r>
-        <w:t xml:space="preserve">agency_work_share, agency_district_share, agency_concentration</w:t>
-      </w:r>
-    </w:p>
-    <w:p>
-      <w:pPr>
-        <w:pStyle w:val="ListParagraph"/>
-        <w:numPr>
-          <w:ilvl w:val="0"/>
-          <w:numId w:val="2"/>
-        </w:numPr>
-        <w:spacing w:after="60"/>
-      </w:pPr>
-      <w:r>
-        <w:t xml:space="preserve">financial_year, feature_version, generated_at</w:t>
-      </w:r>
-    </w:p>
-    <w:p>
-      <w:pPr>
-        <w:pStyle w:val="Heading1"/>
-        <w:spacing w:after="160" w:before="360"/>
-      </w:pPr>
-      <w:r>
-        <w:rPr>
-          <w:b/>
-          <w:bCs/>
-          <w:color w:val="1F3864"/>
-          <w:sz w:val="30"/>
-          <w:szCs w:val="30"/>
-        </w:rPr>
-        <w:t xml:space="preserve">5. Detection Engines</w:t>
-      </w:r>
-    </w:p>
-    <w:p>
-      <w:pPr>
-        <w:pStyle w:val="Heading2"/>
-        <w:spacing w:after="120" w:before="260"/>
-      </w:pPr>
-      <w:r>
-        <w:rPr>
-          <w:b/>
-          <w:bCs/>
-          <w:color w:val="2E5C8A"/>
-          <w:sz w:val="25"/>
-          <w:szCs w:val="25"/>
-        </w:rPr>
-        <w:t xml:space="preserve">5.1 Cost Anomaly Engine</w:t>
-      </w:r>
-    </w:p>
-    <w:p>
-      <w:pPr>
-        <w:spacing w:after="120"/>
-      </w:pPr>
-      <w:r>
-        <w:t xml:space="preserve">Question: is this work unusually expensive compared with appropriate peer works?</w:t>
-      </w:r>
-    </w:p>
-    <w:p>
-      <w:pPr>
-        <w:pStyle w:val="ListParagraph"/>
-        <w:numPr>
-          <w:ilvl w:val="0"/>
-          <w:numId w:val="2"/>
-        </w:numPr>
-        <w:spacing w:after="60"/>
-      </w:pPr>
-      <w:r>
-        <w:t xml:space="preserve">Peer grouping (preferred): work category, district, state, financial year</w:t>
-      </w:r>
-    </w:p>
-    <w:p>
-      <w:pPr>
-        <w:pStyle w:val="ListParagraph"/>
-        <w:numPr>
-          <w:ilvl w:val="0"/>
-          <w:numId w:val="2"/>
-        </w:numPr>
-        <w:spacing w:after="60"/>
-      </w:pPr>
-      <w:r>
-        <w:t xml:space="preserve">Additional dimensions where available: urban/rural, work scale, capacity, repair vs new construction</w:t>
-      </w:r>
-    </w:p>
-    <w:p>
-      <w:pPr>
-        <w:pStyle w:val="ListParagraph"/>
-        <w:numPr>
-          <w:ilvl w:val="0"/>
-          <w:numId w:val="2"/>
-        </w:numPr>
-        <w:spacing w:after="60"/>
-      </w:pPr>
-      <w:r>
-        <w:t xml:space="preserve">Algorithm: peer statistical comparison (median absolute deviation, not raw z-score) + Isolation Forest</w:t>
+        <w:t xml:space="preserve">Frontend (src/)</w:t>
       </w:r>
     </w:p>
     <w:p>
@@ -1542,77 +1357,534 @@
           <w:sz w:val="18"/>
           <w:szCs w:val="18"/>
         </w:rPr>
-        <w:t xml:space="preserve">{</w:t>
-      </w:r>
-      <w:r>
-        <w:rPr>
-          <w:rFonts w:ascii="Consolas" w:cs="Consolas" w:eastAsia="Consolas" w:hAnsi="Consolas"/>
-          <w:color w:val="333333"/>
-          <w:sz w:val="18"/>
-          <w:szCs w:val="18"/>
-        </w:rPr>
-        <w:br/>
-        <w:t xml:space="preserve">  "score": 92,</w:t>
-      </w:r>
-      <w:r>
-        <w:rPr>
-          <w:rFonts w:ascii="Consolas" w:cs="Consolas" w:eastAsia="Consolas" w:hAnsi="Consolas"/>
-          <w:color w:val="333333"/>
-          <w:sz w:val="18"/>
-          <w:szCs w:val="18"/>
-        </w:rPr>
-        <w:br/>
-        <w:t xml:space="preserve">  "peer_median": 3400000,</w:t>
-      </w:r>
-      <w:r>
-        <w:rPr>
-          <w:rFonts w:ascii="Consolas" w:cs="Consolas" w:eastAsia="Consolas" w:hAnsi="Consolas"/>
-          <w:color w:val="333333"/>
-          <w:sz w:val="18"/>
-          <w:szCs w:val="18"/>
-        </w:rPr>
-        <w:br/>
-        <w:t xml:space="preserve">  "current_amount": 5000000,</w:t>
-      </w:r>
-      <w:r>
-        <w:rPr>
-          <w:rFonts w:ascii="Consolas" w:cs="Consolas" w:eastAsia="Consolas" w:hAnsi="Consolas"/>
-          <w:color w:val="333333"/>
-          <w:sz w:val="18"/>
-          <w:szCs w:val="18"/>
-        </w:rPr>
-        <w:br/>
-        <w:t xml:space="preserve">  "deviation_percentage": 47,</w:t>
-      </w:r>
-      <w:r>
-        <w:rPr>
-          <w:rFonts w:ascii="Consolas" w:cs="Consolas" w:eastAsia="Consolas" w:hAnsi="Consolas"/>
-          <w:color w:val="333333"/>
-          <w:sz w:val="18"/>
-          <w:szCs w:val="18"/>
-        </w:rPr>
-        <w:br/>
-        <w:t xml:space="preserve">  "peer_count": 38,</w:t>
-      </w:r>
-      <w:r>
-        <w:rPr>
-          <w:rFonts w:ascii="Consolas" w:cs="Consolas" w:eastAsia="Consolas" w:hAnsi="Consolas"/>
-          <w:color w:val="333333"/>
-          <w:sz w:val="18"/>
-          <w:szCs w:val="18"/>
-        </w:rPr>
-        <w:br/>
-        <w:t xml:space="preserve">  "reason_code": "COST_ABOVE_PEER_MEDIAN"</w:t>
-      </w:r>
-      <w:r>
-        <w:rPr>
-          <w:rFonts w:ascii="Consolas" w:cs="Consolas" w:eastAsia="Consolas" w:hAnsi="Consolas"/>
-          <w:color w:val="333333"/>
-          <w:sz w:val="18"/>
-          <w:szCs w:val="18"/>
-        </w:rPr>
-        <w:br/>
-        <w:t xml:space="preserve">}</w:t>
+        <w:t xml:space="preserve">src/</w:t>
+      </w:r>
+      <w:r>
+        <w:rPr>
+          <w:rFonts w:ascii="Consolas" w:cs="Consolas" w:eastAsia="Consolas" w:hAnsi="Consolas"/>
+          <w:color w:val="333333"/>
+          <w:sz w:val="18"/>
+          <w:szCs w:val="18"/>
+        </w:rPr>
+        <w:br/>
+        <w:t xml:space="preserve">  lib/supabaseClient.ts   -- supabase-js init (anon key, RLS-scoped)</w:t>
+      </w:r>
+      <w:r>
+        <w:rPr>
+          <w:rFonts w:ascii="Consolas" w:cs="Consolas" w:eastAsia="Consolas" w:hAnsi="Consolas"/>
+          <w:color w:val="333333"/>
+          <w:sz w:val="18"/>
+          <w:szCs w:val="18"/>
+        </w:rPr>
+        <w:br/>
+        <w:t xml:space="preserve">  features/works/  features/inspections/  features/compliance/</w:t>
+      </w:r>
+      <w:r>
+        <w:rPr>
+          <w:rFonts w:ascii="Consolas" w:cs="Consolas" w:eastAsia="Consolas" w:hAnsi="Consolas"/>
+          <w:color w:val="333333"/>
+          <w:sz w:val="18"/>
+          <w:szCs w:val="18"/>
+        </w:rPr>
+        <w:br/>
+        <w:t xml:space="preserve">  features/fundFlow/  features/agencies/  features/analytics/</w:t>
+      </w:r>
+      <w:r>
+        <w:rPr>
+          <w:rFonts w:ascii="Consolas" w:cs="Consolas" w:eastAsia="Consolas" w:hAnsi="Consolas"/>
+          <w:color w:val="333333"/>
+          <w:sz w:val="18"/>
+          <w:szCs w:val="18"/>
+        </w:rPr>
+        <w:br/>
+        <w:t xml:space="preserve">  features/dataQuality/  features/audit/  features/settings/</w:t>
+      </w:r>
+    </w:p>
+    <w:p>
+      <w:pPr>
+        <w:pStyle w:val="Heading1"/>
+        <w:spacing w:after="160" w:before="360"/>
+      </w:pPr>
+      <w:r>
+        <w:rPr>
+          <w:b/>
+          <w:bCs/>
+          <w:color w:val="1F3864"/>
+          <w:sz w:val="30"/>
+          <w:szCs w:val="30"/>
+        </w:rPr>
+        <w:t xml:space="preserve">4. Database Design</w:t>
+      </w:r>
+    </w:p>
+    <w:p>
+      <w:pPr>
+        <w:spacing w:after="120"/>
+      </w:pPr>
+      <w:r>
+        <w:t xml:space="preserve">Tables are unchanged from the prior (Spring Boot) revision: works, fund_releases, work_progress, profiles, detection_results, risk_scores, compliance_rules, compliance_flags, duplicate_candidates, fund_anomalies, data_quality_results, inspections, and audit_log. Every table now also carries an RLS policy set (Section 10).</w:t>
+      </w:r>
+    </w:p>
+    <w:p>
+      <w:pPr>
+        <w:pStyle w:val="Heading3"/>
+        <w:spacing w:after="100" w:before="200"/>
+      </w:pPr>
+      <w:r>
+        <w:rPr>
+          <w:b/>
+          <w:bCs/>
+          <w:color w:val="1F3864"/>
+          <w:sz w:val="22"/>
+          <w:szCs w:val="22"/>
+        </w:rPr>
+        <w:t xml:space="preserve">4.1 works — central table</w:t>
+      </w:r>
+    </w:p>
+    <w:p>
+      <w:pPr>
+        <w:pStyle w:val="ListParagraph"/>
+        <w:numPr>
+          <w:ilvl w:val="0"/>
+          <w:numId w:val="2"/>
+        </w:numPr>
+        <w:spacing w:after="60"/>
+      </w:pPr>
+      <w:r>
+        <w:t xml:space="preserve">id, unique_work_number, work_name, work_category</w:t>
+      </w:r>
+    </w:p>
+    <w:p>
+      <w:pPr>
+        <w:pStyle w:val="ListParagraph"/>
+        <w:numPr>
+          <w:ilvl w:val="0"/>
+          <w:numId w:val="2"/>
+        </w:numPr>
+        <w:spacing w:after="60"/>
+      </w:pPr>
+      <w:r>
+        <w:t xml:space="preserve">state, implementing_district, nodal_district</w:t>
+      </w:r>
+    </w:p>
+    <w:p>
+      <w:pPr>
+        <w:pStyle w:val="ListParagraph"/>
+        <w:numPr>
+          <w:ilvl w:val="0"/>
+          <w:numId w:val="2"/>
+        </w:numPr>
+        <w:spacing w:after="60"/>
+      </w:pPr>
+      <w:r>
+        <w:t xml:space="preserve">mp_id, house_name, implementing_agency_id</w:t>
+      </w:r>
+    </w:p>
+    <w:p>
+      <w:pPr>
+        <w:pStyle w:val="ListParagraph"/>
+        <w:numPr>
+          <w:ilvl w:val="0"/>
+          <w:numId w:val="2"/>
+        </w:numPr>
+        <w:spacing w:after="60"/>
+      </w:pPr>
+      <w:r>
+        <w:t xml:space="preserve">sanction_amount, actual_expenditure, released_amount</w:t>
+      </w:r>
+    </w:p>
+    <w:p>
+      <w:pPr>
+        <w:pStyle w:val="ListParagraph"/>
+        <w:numPr>
+          <w:ilvl w:val="0"/>
+          <w:numId w:val="2"/>
+        </w:numPr>
+        <w:spacing w:after="60"/>
+      </w:pPr>
+      <w:r>
+        <w:t xml:space="preserve">recommendation_date, administrative_approval_date, sanction_date, commencement_date, latest_progress_date, completion_date, final_payment_date, completion_marking_date, handover_date</w:t>
+      </w:r>
+    </w:p>
+    <w:p>
+      <w:pPr>
+        <w:pStyle w:val="ListParagraph"/>
+        <w:numPr>
+          <w:ilvl w:val="0"/>
+          <w:numId w:val="2"/>
+        </w:numPr>
+        <w:spacing w:after="60"/>
+      </w:pPr>
+      <w:r>
+        <w:t xml:space="preserve">work_status, financial_year, latitude, longitude</w:t>
+      </w:r>
+    </w:p>
+    <w:p>
+      <w:pPr>
+        <w:pStyle w:val="ListParagraph"/>
+        <w:numPr>
+          <w:ilvl w:val="0"/>
+          <w:numId w:val="2"/>
+        </w:numPr>
+        <w:spacing w:after="60"/>
+      </w:pPr>
+      <w:r>
+        <w:t xml:space="preserve">data_confidence, created_at, updated_at</w:t>
+      </w:r>
+    </w:p>
+    <w:p>
+      <w:pPr>
+        <w:spacing w:after="120"/>
+      </w:pPr>
+      <w:r>
+        <w:rPr>
+          <w:i/>
+          <w:iCs/>
+          <w:color w:val="666666"/>
+          <w:sz w:val="20"/>
+          <w:szCs w:val="20"/>
+        </w:rPr>
+        <w:t xml:space="preserve">unique_work_number is the primary external identifier for integration and duplicate checks.</w:t>
+      </w:r>
+    </w:p>
+    <w:p>
+      <w:pPr>
+        <w:pStyle w:val="Heading3"/>
+        <w:spacing w:after="100" w:before="200"/>
+      </w:pPr>
+      <w:r>
+        <w:rPr>
+          <w:b/>
+          <w:bCs/>
+          <w:color w:val="1F3864"/>
+          <w:sz w:val="22"/>
+          <w:szCs w:val="22"/>
+        </w:rPr>
+        <w:t xml:space="preserve">4.2 fund_releases</w:t>
+      </w:r>
+    </w:p>
+    <w:p>
+      <w:pPr>
+        <w:pStyle w:val="ListParagraph"/>
+        <w:numPr>
+          <w:ilvl w:val="0"/>
+          <w:numId w:val="2"/>
+        </w:numPr>
+        <w:spacing w:after="60"/>
+      </w:pPr>
+      <w:r>
+        <w:t xml:space="preserve">id, work_id (FK), installment_number, amount, release_date, transaction_type, source_reference, created_at</w:t>
+      </w:r>
+    </w:p>
+    <w:p>
+      <w:pPr>
+        <w:spacing w:after="120"/>
+      </w:pPr>
+      <w:r>
+        <w:rPr>
+          <w:i/>
+          <w:iCs/>
+          <w:color w:val="666666"/>
+          <w:sz w:val="20"/>
+          <w:szCs w:val="20"/>
+        </w:rPr>
+        <w:t xml:space="preserve">Kept as a proper child table (not a JSON blob) so the Fund Flow timeline can be built directly from rows via PostgREST.</w:t>
+      </w:r>
+    </w:p>
+    <w:p>
+      <w:pPr>
+        <w:pStyle w:val="Heading3"/>
+        <w:spacing w:after="100" w:before="200"/>
+      </w:pPr>
+      <w:r>
+        <w:rPr>
+          <w:b/>
+          <w:bCs/>
+          <w:color w:val="1F3864"/>
+          <w:sz w:val="22"/>
+          <w:szCs w:val="22"/>
+        </w:rPr>
+        <w:t xml:space="preserve">4.3 work_progress</w:t>
+      </w:r>
+    </w:p>
+    <w:p>
+      <w:pPr>
+        <w:pStyle w:val="ListParagraph"/>
+        <w:numPr>
+          <w:ilvl w:val="0"/>
+          <w:numId w:val="2"/>
+        </w:numPr>
+        <w:spacing w:after="60"/>
+      </w:pPr>
+      <w:r>
+        <w:t xml:space="preserve">id, work_id, progress_date, physical_progress, financial_progress, work_status, remarks, source_reference, created_at</w:t>
+      </w:r>
+    </w:p>
+    <w:p>
+      <w:pPr>
+        <w:spacing w:after="120"/>
+      </w:pPr>
+      <w:r>
+        <w:t xml:space="preserve">Both progress fields are nullable. A missing value is stored as null with data_available: false, never assumed to be 0.</w:t>
+      </w:r>
+    </w:p>
+    <w:p>
+      <w:pPr>
+        <w:pStyle w:val="Heading3"/>
+        <w:spacing w:after="100" w:before="200"/>
+      </w:pPr>
+      <w:r>
+        <w:rPr>
+          <w:b/>
+          <w:bCs/>
+          <w:color w:val="1F3864"/>
+          <w:sz w:val="22"/>
+          <w:szCs w:val="22"/>
+        </w:rPr>
+        <w:t xml:space="default"/>
+      </w:r>
+    </w:p>
+    <w:p>
+      <w:pPr>
+        <w:spacing w:after="120"/>
+      </w:pPr>
+      <w:r>
+        <w:t xml:space="preserve">Replaces the standalone Spring Boot users table. One row per Supabase Auth user (auth.users.id as the primary key / foreign key), extended with app-specific fields.</w:t>
+      </w:r>
+    </w:p>
+    <w:p>
+      <w:pPr>
+        <w:pStyle w:val="ListParagraph"/>
+        <w:numPr>
+          <w:ilvl w:val="0"/>
+          <w:numId w:val="2"/>
+        </w:numPr>
+        <w:spacing w:after="60"/>
+      </w:pPr>
+      <w:r>
+        <w:t xml:space="preserve">id (references auth.users.id), name, role</w:t>
+      </w:r>
+    </w:p>
+    <w:p>
+      <w:pPr>
+        <w:pStyle w:val="ListParagraph"/>
+        <w:numPr>
+          <w:ilvl w:val="0"/>
+          <w:numId w:val="2"/>
+        </w:numPr>
+        <w:spacing w:after="60"/>
+      </w:pPr>
+      <w:r>
+        <w:t xml:space="preserve">constituency_id, district_id, state_id</w:t>
+      </w:r>
+    </w:p>
+    <w:p>
+      <w:pPr>
+        <w:pStyle w:val="ListParagraph"/>
+        <w:numPr>
+          <w:ilvl w:val="0"/>
+          <w:numId w:val="2"/>
+        </w:numPr>
+        <w:spacing w:after="60"/>
+      </w:pPr>
+      <w:r>
+        <w:t xml:space="preserve">active, created_at, updated_at</w:t>
+      </w:r>
+    </w:p>
+    <w:p>
+      <w:pPr>
+        <w:pStyle w:val="ListParagraph"/>
+        <w:numPr>
+          <w:ilvl w:val="0"/>
+          <w:numId w:val="2"/>
+        </w:numPr>
+        <w:spacing w:after="60"/>
+      </w:pPr>
+      <w:r>
+        <w:t xml:space="preserve">Roles: MP, district_officer, state_admin, mospi_admin</w:t>
+      </w:r>
+    </w:p>
+    <w:p>
+      <w:pPr>
+        <w:spacing w:after="120"/>
+      </w:pPr>
+      <w:r>
+        <w:rPr>
+          <w:i/>
+          <w:iCs/>
+          <w:color w:val="666666"/>
+          <w:sz w:val="20"/>
+          <w:szCs w:val="20"/>
+        </w:rPr>
+        <w:t xml:space="preserve">Role and scope are read from this table by RLS policies on every other table, and are also embedded into the session JWT as custom claims via a Supabase Auth hook so Edge Functions can check them without an extra query.</w:t>
+      </w:r>
+    </w:p>
+    <w:p>
+      <w:pPr>
+        <w:pStyle w:val="Heading3"/>
+        <w:spacing w:after="100" w:before="200"/>
+      </w:pPr>
+      <w:r>
+        <w:rPr>
+          <w:b/>
+          <w:bCs/>
+          <w:color w:val="1F3864"/>
+          <w:sz w:val="22"/>
+          <w:szCs w:val="22"/>
+        </w:rPr>
+        <w:t xml:space="preserve">4.5 data_quality_results</w:t>
+      </w:r>
+    </w:p>
+    <w:p>
+      <w:pPr>
+        <w:pStyle w:val="ListParagraph"/>
+        <w:numPr>
+          <w:ilvl w:val="0"/>
+          <w:numId w:val="2"/>
+        </w:numPr>
+        <w:spacing w:after="60"/>
+      </w:pPr>
+      <w:r>
+        <w:t xml:space="preserve">id, work_id, field_name, issue_type, severity, message, created_at</w:t>
+      </w:r>
+    </w:p>
+    <w:p>
+      <w:pPr>
+        <w:pStyle w:val="ListParagraph"/>
+        <w:numPr>
+          <w:ilvl w:val="0"/>
+          <w:numId w:val="2"/>
+        </w:numPr>
+        <w:spacing w:after="60"/>
+      </w:pPr>
+      <w:r>
+        <w:t xml:space="preserve">issue_type values: MISSING_FIELD, INVALID_DATE, INVALID_AMOUNT, INVALID_STATUS, INVALID_DISTRICT, INVALID_AGENCY, DUPLICATE_WORK_ID, INCONSISTENT_DATA</w:t>
+      </w:r>
+    </w:p>
+    <w:p>
+      <w:pPr>
+        <w:spacing w:after="120"/>
+      </w:pPr>
+      <w:r>
+        <w:rPr>
+          <w:b/>
+          <w:bCs/>
+        </w:rPr>
+        <w:t xml:space="preserve">Insufficient Data is not Low Risk.</w:t>
+      </w:r>
+      <w:r>
+        <w:t xml:space="preserve"> Risk levels are LOW / MEDIUM / HIGH / INSUFFICIENT_DATA — the last is a separate state, not a numeric bucket.</w:t>
+      </w:r>
+    </w:p>
+    <w:p>
+      <w:pPr>
+        <w:pStyle w:val="Heading3"/>
+        <w:spacing w:after="100" w:before="200"/>
+      </w:pPr>
+      <w:r>
+        <w:rPr>
+          <w:b/>
+          <w:bCs/>
+          <w:color w:val="1F3864"/>
+          <w:sz w:val="22"/>
+          <w:szCs w:val="22"/>
+        </w:rPr>
+        <w:t xml:space="preserve">4.6 work_features</w:t>
+      </w:r>
+    </w:p>
+    <w:p>
+      <w:pPr>
+        <w:pStyle w:val="ListParagraph"/>
+        <w:numPr>
+          <w:ilvl w:val="0"/>
+          <w:numId w:val="2"/>
+        </w:numPr>
+        <w:spacing w:after="60"/>
+      </w:pPr>
+      <w:r>
+        <w:t xml:space="preserve">work_id, cost_peer_median, cost_peer_mad, cost_deviation, project_age_days</w:t>
+      </w:r>
+    </w:p>
+    <w:p>
+      <w:pPr>
+        <w:pStyle w:val="ListParagraph"/>
+        <w:numPr>
+          <w:ilvl w:val="0"/>
+          <w:numId w:val="2"/>
+        </w:numPr>
+        <w:spacing w:after="60"/>
+      </w:pPr>
+      <w:r>
+        <w:t xml:space="preserve">sanction_delay_days, start_delay_days, execution_delay_days, payment_delay_days, closure_delay_days</w:t>
+      </w:r>
+    </w:p>
+    <w:p>
+      <w:pPr>
+        <w:pStyle w:val="ListParagraph"/>
+        <w:numPr>
+          <w:ilvl w:val="0"/>
+          <w:numId w:val="2"/>
+        </w:numPr>
+        <w:spacing w:after="60"/>
+      </w:pPr>
+      <w:r>
+        <w:t xml:space="preserve">released_percentage, expenditure_percentage, duplicate_text_similarity</w:t>
+      </w:r>
+    </w:p>
+    <w:p>
+      <w:pPr>
+        <w:pStyle w:val="ListParagraph"/>
+        <w:numPr>
+          <w:ilvl w:val="0"/>
+          <w:numId w:val="2"/>
+        </w:numPr>
+        <w:spacing w:after="60"/>
+      </w:pPr>
+      <w:r>
+        <w:t xml:space="preserve">agency_work_share, agency_district_share, agency_concentration</w:t>
+      </w:r>
+    </w:p>
+    <w:p>
+      <w:pPr>
+        <w:pStyle w:val="ListParagraph"/>
+        <w:numPr>
+          <w:ilvl w:val="0"/>
+          <w:numId w:val="2"/>
+        </w:numPr>
+        <w:spacing w:after="60"/>
+      </w:pPr>
+      <w:r>
+        <w:t xml:space="preserve">financial_year, feature_version, generated_at</w:t>
+      </w:r>
+    </w:p>
+    <w:p>
+      <w:pPr>
+        <w:pStyle w:val="Heading1"/>
+        <w:spacing w:after="160" w:before="360"/>
+      </w:pPr>
+      <w:r>
+        <w:rPr>
+          <w:b/>
+          <w:bCs/>
+          <w:color w:val="1F3864"/>
+          <w:sz w:val="30"/>
+          <w:szCs w:val="30"/>
+        </w:rPr>
+        <w:t xml:space="preserve">5. Detection Engines</w:t>
+      </w:r>
+    </w:p>
+    <w:p>
+      <w:pPr>
+        <w:spacing w:after="120"/>
+      </w:pPr>
+      <w:r>
+        <w:rPr>
+          <w:i/>
+          <w:iCs/>
+          <w:color w:val="666666"/>
+          <w:sz w:val="20"/>
+          <w:szCs w:val="20"/>
+        </w:rPr>
+        <w:t xml:space="preserve">Algorithms and outputs are unchanged from the prior revision — only how results reach the database changes: the Python ML layer writes directly into Supabase Postgres tables using the service-role key (server-side batch job, not exposed to the browser).</w:t>
       </w:r>
     </w:p>
     <w:p>
@@ -1628,7 +1900,7 @@
           <w:sz w:val="25"/>
           <w:szCs w:val="25"/>
         </w:rPr>
-        <w:t xml:space="preserve">5.2 Delay / Lifecycle Engine</w:t>
+        <w:t xml:space="preserve">5.1 Cost Anomaly Engine</w:t>
       </w:r>
     </w:p>
     <w:p>
@@ -1636,7 +1908,46 @@
         <w:spacing w:after="120"/>
       </w:pPr>
       <w:r>
-        <w:t xml:space="default"/>
+        <w:t xml:space="preserve">Question: is this work unusually expensive compared with appropriate peer works?</w:t>
+      </w:r>
+    </w:p>
+    <w:p>
+      <w:pPr>
+        <w:pStyle w:val="ListParagraph"/>
+        <w:numPr>
+          <w:ilvl w:val="0"/>
+          <w:numId w:val="2"/>
+        </w:numPr>
+        <w:spacing w:after="60"/>
+      </w:pPr>
+      <w:r>
+        <w:t xml:space="preserve">Peer grouping (preferred): work category, district, state, financial year</w:t>
+      </w:r>
+    </w:p>
+    <w:p>
+      <w:pPr>
+        <w:pStyle w:val="ListParagraph"/>
+        <w:numPr>
+          <w:ilvl w:val="0"/>
+          <w:numId w:val="2"/>
+        </w:numPr>
+        <w:spacing w:after="60"/>
+      </w:pPr>
+      <w:r>
+        <w:t xml:space="preserve">Additional dimensions where available: urban/rural, work scale, capacity, repair vs new construction</w:t>
+      </w:r>
+    </w:p>
+    <w:p>
+      <w:pPr>
+        <w:pStyle w:val="ListParagraph"/>
+        <w:numPr>
+          <w:ilvl w:val="0"/>
+          <w:numId w:val="2"/>
+        </w:numPr>
+        <w:spacing w:after="60"/>
+      </w:pPr>
+      <w:r>
+        <w:t xml:space="preserve">Algorithm: peer statistical comparison (median absolute deviation, not raw z-score) + Isolation Forest</w:t>
       </w:r>
     </w:p>
     <w:p>
@@ -1657,30 +1968,108 @@
           <w:sz w:val="18"/>
           <w:szCs w:val="18"/>
         </w:rPr>
-        <w:t xml:space="preserve">Recommendation -&gt; District Action -&gt; Sanction -&gt; Commencement</w:t>
-      </w:r>
-      <w:r>
-        <w:rPr>
-          <w:rFonts w:ascii="Consolas" w:cs="Consolas" w:eastAsia="Consolas" w:hAnsi="Consolas"/>
-          <w:color w:val="333333"/>
-          <w:sz w:val="18"/>
-          <w:szCs w:val="18"/>
-        </w:rPr>
-        <w:br/>
-        <w:t xml:space="preserve">-&gt; Execution -&gt; Payment -&gt; Completion -&gt; Handover</w:t>
-      </w:r>
-    </w:p>
-    <w:p>
-      <w:pPr>
-        <w:pStyle w:val="ListParagraph"/>
-        <w:numPr>
-          <w:ilvl w:val="0"/>
-          <w:numId w:val="2"/>
-        </w:numPr>
-        <w:spacing w:after="60"/>
-      </w:pPr>
-      <w:r>
-        <w:t xml:space="preserve">Outputs: sanction_delay_days, start_delay_days, execution_delay_days, payment_delay_days, closure_delay_days</w:t>
+        <w:t xml:space="preserve">{</w:t>
+      </w:r>
+      <w:r>
+        <w:rPr>
+          <w:rFonts w:ascii="Consolas" w:cs="Consolas" w:eastAsia="Consolas" w:hAnsi="Consolas"/>
+          <w:color w:val="333333"/>
+          <w:sz w:val="18"/>
+          <w:szCs w:val="18"/>
+        </w:rPr>
+        <w:br/>
+        <w:t xml:space="preserve">  "score": 92,</w:t>
+      </w:r>
+      <w:r>
+        <w:rPr>
+          <w:rFonts w:ascii="Consolas" w:cs="Consolas" w:eastAsia="Consolas" w:hAnsi="Consolas"/>
+          <w:color w:val="333333"/>
+          <w:sz w:val="18"/>
+          <w:szCs w:val="18"/>
+        </w:rPr>
+        <w:br/>
+        <w:t xml:space="preserve">  "peer_median": 3400000,</w:t>
+      </w:r>
+      <w:r>
+        <w:rPr>
+          <w:rFonts w:ascii="Consolas" w:cs="Consolas" w:eastAsia="Consolas" w:hAnsi="Consolas"/>
+          <w:color w:val="333333"/>
+          <w:sz w:val="18"/>
+          <w:szCs w:val="18"/>
+        </w:rPr>
+        <w:br/>
+        <w:t xml:space="preserve">  "current_amount": 5000000,</w:t>
+      </w:r>
+      <w:r>
+        <w:rPr>
+          <w:rFonts w:ascii="Consolas" w:cs="Consolas" w:eastAsia="Consolas" w:hAnsi="Consolas"/>
+          <w:color w:val="333333"/>
+          <w:sz w:val="18"/>
+          <w:szCs w:val="18"/>
+        </w:rPr>
+        <w:br/>
+        <w:t xml:space="preserve">  "deviation_percentage": 47,</w:t>
+      </w:r>
+      <w:r>
+        <w:rPr>
+          <w:rFonts w:ascii="Consolas" w:cs="Consolas" w:eastAsia="Consolas" w:hAnsi="Consolas"/>
+          <w:color w:val="333333"/>
+          <w:sz w:val="18"/>
+          <w:szCs w:val="18"/>
+        </w:rPr>
+        <w:br/>
+        <w:t xml:space="preserve">  "peer_count": 38,</w:t>
+      </w:r>
+      <w:r>
+        <w:rPr>
+          <w:rFonts w:ascii="Consolas" w:cs="Consolas" w:eastAsia="Consolas" w:hAnsi="Consolas"/>
+          <w:color w:val="333333"/>
+          <w:sz w:val="18"/>
+          <w:szCs w:val="18"/>
+        </w:rPr>
+        <w:br/>
+        <w:t xml:space="preserve">  "reason_code": "COST_ABOVE_PEER_MEDIAN"</w:t>
+      </w:r>
+      <w:r>
+        <w:rPr>
+          <w:rFonts w:ascii="Consolas" w:cs="Consolas" w:eastAsia="Consolas" w:hAnsi="Consolas"/>
+          <w:color w:val="333333"/>
+          <w:sz w:val="18"/>
+          <w:szCs w:val="18"/>
+        </w:rPr>
+        <w:br/>
+        <w:t xml:space="preserve">}</w:t>
+      </w:r>
+    </w:p>
+    <w:p>
+      <w:pPr>
+        <w:pStyle w:val="Heading2"/>
+        <w:spacing w:after="120" w:before="260"/>
+      </w:pPr>
+      <w:r>
+        <w:rPr>
+          <w:b/>
+          <w:bCs/>
+          <w:color w:val="2E5C8A"/>
+          <w:sz w:val="25"/>
+          <w:szCs w:val="25"/>
+        </w:rPr>
+        <w:t xml:space="preserve">5.2 Delay / Lifecycle Engine</w:t>
+      </w:r>
+    </w:p>
+    <w:p>
+      <w:pPr>
+        <w:spacing w:after="120"/>
+      </w:pPr>
+      <w:r>
+        <w:rPr>
+          <w:b/>
+          <w:bCs/>
+        </w:rPr>
+        <w:t xml:space="preserve">Not a single delay number.</w:t>
+      </w:r>
+      <w:r>
+        <w:t xml:space="preserve"> The pipeline calculates gaps at each stage of the MPLADS lifecycle.</w:t>
       </w:r>
     </w:p>
     <w:p>
@@ -1701,49 +2090,30 @@
           <w:sz w:val="18"/>
           <w:szCs w:val="18"/>
         </w:rPr>
-        <w:t xml:space="preserve">{ "sanction": false, "start": true, "execution": true, "payment": false, "closure": false }</w:t>
-      </w:r>
-    </w:p>
-    <w:p>
-      <w:pPr>
-        <w:spacing w:after="120"/>
-      </w:pPr>
-      <w:r>
-        <w:t xml:space="preserve">Delay status values: ON_TIME, LATE, STALLED, COMPLETED, UNKNOWN. UNKNOWN is used whenever the dates needed to determine delay are not available — it must never default to ON_TIME.</w:t>
-      </w:r>
-    </w:p>
-    <w:p>
-      <w:pPr>
-        <w:pStyle w:val="Heading2"/>
-        <w:spacing w:after="120" w:before="260"/>
-      </w:pPr>
-      <w:r>
-        <w:rPr>
-          <w:b/>
-          <w:bCs/>
-          <w:color w:val="2E5C8A"/>
-          <w:sz w:val="25"/>
-          <w:szCs w:val="25"/>
-        </w:rPr>
-        <w:t xml:space="preserve">5.3 Duplicate Detection Engine</w:t>
-      </w:r>
-      <w:r>
-        <w:rPr>
-          <w:b/>
-          <w:bCs/>
-          <w:color w:val="8A6D00"/>
-          <w:sz w:val="18"/>
-          <w:szCs w:val="18"/>
-        </w:rPr>
-        <w:t xml:space="preserve">  [CHANGED FROM PRELIMINARY DRAFT]</w:t>
-      </w:r>
-    </w:p>
-    <w:p>
-      <w:pPr>
-        <w:spacing w:after="120"/>
-      </w:pPr>
-      <w:r>
-        <w:t xml:space="preserve">Text similarity alone produces false positives. This engine combines text with structured signals in a staged pipeline.</w:t>
+        <w:t xml:space="preserve">Recommendation -&gt; District Action -&gt; Sanction -&gt; Commencement</w:t>
+      </w:r>
+      <w:r>
+        <w:rPr>
+          <w:rFonts w:ascii="Consolas" w:cs="Consolas" w:eastAsia="Consolas" w:hAnsi="Consolas"/>
+          <w:color w:val="333333"/>
+          <w:sz w:val="18"/>
+          <w:szCs w:val="18"/>
+        </w:rPr>
+        <w:br/>
+        <w:t xml:space="preserve">-&gt; Execution -&gt; Payment -&gt; Completion -&gt; Handover</w:t>
+      </w:r>
+    </w:p>
+    <w:p>
+      <w:pPr>
+        <w:pStyle w:val="ListParagraph"/>
+        <w:numPr>
+          <w:ilvl w:val="0"/>
+          <w:numId w:val="2"/>
+        </w:numPr>
+        <w:spacing w:after="60"/>
+      </w:pPr>
+      <w:r>
+        <w:t xml:space="preserve">Outputs: sanction_delay_days, start_delay_days, execution_delay_days, payment_delay_days, closure_delay_days</w:t>
       </w:r>
     </w:p>
     <w:p>
@@ -1764,92 +2134,15 @@
           <w:sz w:val="18"/>
           <w:szCs w:val="18"/>
         </w:rPr>
-        <w:t xml:space="preserve">Work descriptions -&gt; Text normalization -&gt; Candidate blocking</w:t>
-      </w:r>
-      <w:r>
-        <w:rPr>
-          <w:rFonts w:ascii="Consolas" w:cs="Consolas" w:eastAsia="Consolas" w:hAnsi="Consolas"/>
-          <w:color w:val="333333"/>
-          <w:sz w:val="18"/>
-          <w:szCs w:val="18"/>
-        </w:rPr>
-        <w:br/>
-        <w:t xml:space="preserve">-&gt; TF-IDF / n-gram similarity -&gt; Sentence Transformer re-rank</w:t>
-      </w:r>
-      <w:r>
-        <w:rPr>
-          <w:rFonts w:ascii="Consolas" w:cs="Consolas" w:eastAsia="Consolas" w:hAnsi="Consolas"/>
-          <w:color w:val="333333"/>
-          <w:sz w:val="18"/>
-          <w:szCs w:val="18"/>
-        </w:rPr>
-        <w:br/>
-        <w:t xml:space="preserve">-&gt; Multi-signal scoring (text/location/agency/amount/date)</w:t>
-      </w:r>
-      <w:r>
-        <w:rPr>
-          <w:rFonts w:ascii="Consolas" w:cs="Consolas" w:eastAsia="Consolas" w:hAnsi="Consolas"/>
-          <w:color w:val="333333"/>
-          <w:sz w:val="18"/>
-          <w:szCs w:val="18"/>
-        </w:rPr>
-        <w:br/>
-        <w:t xml:space="preserve">-&gt; Candidate duplicate -&gt; Human review</w:t>
-      </w:r>
-    </w:p>
-    <w:p>
-      <w:pPr>
-        <w:pStyle w:val="Heading3"/>
-        <w:spacing w:after="100" w:before="200"/>
-      </w:pPr>
-      <w:r>
-        <w:rPr>
-          <w:b/>
-          <w:bCs/>
-          <w:color w:val="1F3864"/>
-          <w:sz w:val="22"/>
-          <w:szCs w:val="22"/>
-        </w:rPr>
-        <w:t xml:space="preserve">duplicate_candidates</w:t>
-      </w:r>
-    </w:p>
-    <w:p>
-      <w:pPr>
-        <w:pStyle w:val="ListParagraph"/>
-        <w:numPr>
-          <w:ilvl w:val="0"/>
-          <w:numId w:val="2"/>
-        </w:numPr>
-        <w:spacing w:after="60"/>
-      </w:pPr>
-      <w:r>
-        <w:t xml:space="preserve">id, work_id, matched_work_id</w:t>
-      </w:r>
-    </w:p>
-    <w:p>
-      <w:pPr>
-        <w:pStyle w:val="ListParagraph"/>
-        <w:numPr>
-          <w:ilvl w:val="0"/>
-          <w:numId w:val="2"/>
-        </w:numPr>
-        <w:spacing w:after="60"/>
-      </w:pPr>
-      <w:r>
-        <w:t xml:space="preserve">text_similarity, location_similarity, agency_similarity, amount_similarity, date_similarity, overall_similarity</w:t>
-      </w:r>
-    </w:p>
-    <w:p>
-      <w:pPr>
-        <w:pStyle w:val="ListParagraph"/>
-        <w:numPr>
-          <w:ilvl w:val="0"/>
-          <w:numId w:val="2"/>
-        </w:numPr>
-        <w:spacing w:after="60"/>
-      </w:pPr>
-      <w:r>
-        <w:t xml:space="preserve">reason, status (PENDING / CONFIRMED / REJECTED), reviewed_by, reviewed_at, created_at</w:t>
+        <w:t xml:space="preserve">{ "sanction": false, "start": true, "execution": true, "payment": false, "closure": false }</w:t>
+      </w:r>
+    </w:p>
+    <w:p>
+      <w:pPr>
+        <w:spacing w:after="120"/>
+      </w:pPr>
+      <w:r>
+        <w:t xml:space="preserve">Delay status values: ON_TIME, LATE, STALLED, COMPLETED, UNKNOWN. UNKNOWN is used whenever the dates needed to determine delay are not available.</w:t>
       </w:r>
     </w:p>
     <w:p>
@@ -1865,17 +2158,17 @@
           <w:sz w:val="25"/>
           <w:szCs w:val="25"/>
         </w:rPr>
-        <w:t xml:space="preserve">5.4 Fund-Flow Anomaly Engine</w:t>
+        <w:t xml:space="preserve">5.3 Duplicate Detection Engine</w:t>
       </w:r>
       <w:r>
         <w:rPr>
           <w:b/>
           <w:bCs/>
-          <w:color w:val="1D6B33"/>
-          <w:sz w:val="18"/>
-          <w:szCs w:val="18"/>
-        </w:rPr>
-        <w:t xml:space="preserve">  [LOCKED BY SYSTEM DESIGN]</w:t>
+          <w:color w:val="8A6D00"/>
+          <w:sz w:val="18"/>
+          <w:szCs w:val="18"/>
+        </w:rPr>
+        <w:t xml:space="preserve">  [CHANGED — SUPABASE]</w:t>
       </w:r>
     </w:p>
     <w:p>
@@ -1883,219 +2176,7 @@
         <w:spacing w:after="120"/>
       </w:pPr>
       <w:r>
-        <w:t xml:space="preserve">A first-class backend module, not folded into the delay detector.</w:t>
-      </w:r>
-    </w:p>
-    <w:p>
-      <w:pPr>
-        <w:pStyle w:val="ListParagraph"/>
-        <w:numPr>
-          <w:ilvl w:val="0"/>
-          <w:numId w:val="2"/>
-        </w:numPr>
-        <w:spacing w:after="60"/>
-      </w:pPr>
-      <w:r>
-        <w:t xml:space="preserve">released_amount &gt; sanction_amount</w:t>
-      </w:r>
-    </w:p>
-    <w:p>
-      <w:pPr>
-        <w:pStyle w:val="ListParagraph"/>
-        <w:numPr>
-          <w:ilvl w:val="0"/>
-          <w:numId w:val="2"/>
-        </w:numPr>
-        <w:spacing w:after="60"/>
-      </w:pPr>
-      <w:r>
-        <w:t xml:space="preserve">high released percentage vs low/unchanged recorded progress (payment–progress mismatch)</w:t>
-      </w:r>
-    </w:p>
-    <w:p>
-      <w:pPr>
-        <w:pStyle w:val="ListParagraph"/>
-        <w:numPr>
-          <w:ilvl w:val="0"/>
-          <w:numId w:val="2"/>
-        </w:numPr>
-        <w:spacing w:after="60"/>
-      </w:pPr>
-      <w:r>
-        <w:t xml:space="preserve">repeated installment releases with no corresponding progress update</w:t>
-      </w:r>
-    </w:p>
-    <w:p>
-      <w:pPr>
-        <w:pStyle w:val="ListParagraph"/>
-        <w:numPr>
-          <w:ilvl w:val="0"/>
-          <w:numId w:val="2"/>
-        </w:numPr>
-        <w:spacing w:after="60"/>
-      </w:pPr>
-      <w:r>
-        <w:t xml:space="preserve">large release immediately after sanction</w:t>
-      </w:r>
-    </w:p>
-    <w:p>
-      <w:pPr>
-        <w:pStyle w:val="ListParagraph"/>
-        <w:numPr>
-          <w:ilvl w:val="0"/>
-          <w:numId w:val="2"/>
-        </w:numPr>
-        <w:spacing w:after="60"/>
-      </w:pPr>
-      <w:r>
-        <w:t xml:space="preserve">unspent funds with long inactivity</w:t>
-      </w:r>
-    </w:p>
-    <w:p>
-      <w:pPr>
-        <w:pStyle w:val="ListParagraph"/>
-        <w:numPr>
-          <w:ilvl w:val="0"/>
-          <w:numId w:val="2"/>
-        </w:numPr>
-        <w:spacing w:after="60"/>
-      </w:pPr>
-      <w:r>
-        <w:t xml:space="preserve">financial-year utilization anomaly / end-of-year spending concentration</w:t>
-      </w:r>
-    </w:p>
-    <w:p>
-      <w:pPr>
-        <w:pStyle w:val="ListParagraph"/>
-        <w:numPr>
-          <w:ilvl w:val="0"/>
-          <w:numId w:val="2"/>
-        </w:numPr>
-        <w:spacing w:after="60"/>
-      </w:pPr>
-      <w:r>
-        <w:t xml:space="preserve">sanction vs expenditure mismatch</w:t>
-      </w:r>
-    </w:p>
-    <w:p>
-      <w:pPr>
-        <w:pStyle w:val="ListParagraph"/>
-        <w:numPr>
-          <w:ilvl w:val="0"/>
-          <w:numId w:val="2"/>
-        </w:numPr>
-        <w:spacing w:after="60"/>
-      </w:pPr>
-      <w:r>
-        <w:t xml:space="preserve">identical payment patterns across works; payment concentration; completed work with incomplete financial closure</w:t>
-      </w:r>
-    </w:p>
-    <w:p>
-      <w:pPr>
-        <w:pStyle w:val="Heading3"/>
-        <w:spacing w:after="100" w:before="200"/>
-      </w:pPr>
-      <w:r>
-        <w:rPr>
-          <w:b/>
-          <w:bCs/>
-          <w:color w:val="1F3864"/>
-          <w:sz w:val="22"/>
-          <w:szCs w:val="22"/>
-        </w:rPr>
-        <w:t xml:space="preserve">fund_anomalies</w:t>
-      </w:r>
-    </w:p>
-    <w:p>
-      <w:pPr>
-        <w:pStyle w:val="ListParagraph"/>
-        <w:numPr>
-          <w:ilvl w:val="0"/>
-          <w:numId w:val="2"/>
-        </w:numPr>
-        <w:spacing w:after="60"/>
-      </w:pPr>
-      <w:r>
-        <w:t xml:space="preserve">id, work_id, anomaly_type, score, severity</w:t>
-      </w:r>
-    </w:p>
-    <w:p>
-      <w:pPr>
-        <w:pStyle w:val="ListParagraph"/>
-        <w:numPr>
-          <w:ilvl w:val="0"/>
-          <w:numId w:val="2"/>
-        </w:numPr>
-        <w:spacing w:after="60"/>
-      </w:pPr>
-      <w:r>
-        <w:t xml:space="preserve">expected_value, actual_value, amount_involved, reason_code, confidence, created_at</w:t>
-      </w:r>
-    </w:p>
-    <w:p>
-      <w:pPr>
-        <w:pStyle w:val="Heading2"/>
-        <w:spacing w:after="120" w:before="260"/>
-      </w:pPr>
-      <w:r>
-        <w:rPr>
-          <w:b/>
-          <w:bCs/>
-          <w:color w:val="2E5C8A"/>
-          <w:sz w:val="25"/>
-          <w:szCs w:val="25"/>
-        </w:rPr>
-        <w:t xml:space="preserve">5.5 Compliance Rules Engine</w:t>
-      </w:r>
-    </w:p>
-    <w:p>
-      <w:pPr>
-        <w:spacing w:after="120"/>
-      </w:pPr>
-      <w:r>
-        <w:t xml:space="preserve">Deterministic wherever possible — a policy layer, not a model trying to learn policy from data.</w:t>
-      </w:r>
-    </w:p>
-    <w:p>
-      <w:pPr>
-        <w:pStyle w:val="Heading3"/>
-        <w:spacing w:after="100" w:before="200"/>
-      </w:pPr>
-      <w:r>
-        <w:rPr>
-          <w:b/>
-          <w:bCs/>
-          <w:color w:val="1F3864"/>
-          <w:sz w:val="22"/>
-          <w:szCs w:val="22"/>
-        </w:rPr>
-        <w:t xml:space="preserve">compliance_rules (reference table)</w:t>
-      </w:r>
-    </w:p>
-    <w:p>
-      <w:pPr>
-        <w:pStyle w:val="ListParagraph"/>
-        <w:numPr>
-          <w:ilvl w:val="0"/>
-          <w:numId w:val="2"/>
-        </w:numPr>
-        <w:spacing w:after="60"/>
-      </w:pPr>
-      <w:r>
-        <w:t xml:space="preserve">rule_id, rule_name, rule_type, description, source_reference, severity, active</w:t>
-      </w:r>
-    </w:p>
-    <w:p>
-      <w:pPr>
-        <w:pStyle w:val="ListParagraph"/>
-        <w:numPr>
-          <w:ilvl w:val="0"/>
-          <w:numId w:val="2"/>
-        </w:numPr>
-        <w:spacing w:after="60"/>
-      </w:pPr>
-      <w:r>
-        <w:t xml:space="preserve">rule_type values: CATEGORY, TIMELINE, ENTITLEMENT, DATA_COMPLETENESS, FINANCIAL, RELATIONSHIP</w:t>
+        <w:t xml:space="preserve">Text similarity alone produces false positives. This engine combines text with structured signals in a staged pipeline.</w:t>
       </w:r>
     </w:p>
     <w:p>
@@ -2116,67 +2197,37 @@
           <w:sz w:val="18"/>
           <w:szCs w:val="18"/>
         </w:rPr>
-        <w:t xml:space="preserve">RULE_RELIGIOUS_WORK          RULE_LAND_ACQUISITION</w:t>
-      </w:r>
-      <w:r>
-        <w:rPr>
-          <w:rFonts w:ascii="Consolas" w:cs="Consolas" w:eastAsia="Consolas" w:hAnsi="Consolas"/>
-          <w:color w:val="333333"/>
-          <w:sz w:val="18"/>
-          <w:szCs w:val="18"/>
-        </w:rPr>
-        <w:br/>
-        <w:t xml:space="preserve">RULE_RESIDENTIAL_WORK        RULE_COMMERCIAL_WORK</w:t>
-      </w:r>
-      <w:r>
-        <w:rPr>
-          <w:rFonts w:ascii="Consolas" w:cs="Consolas" w:eastAsia="Consolas" w:hAnsi="Consolas"/>
-          <w:color w:val="333333"/>
-          <w:sz w:val="18"/>
-          <w:szCs w:val="18"/>
-        </w:rPr>
-        <w:br/>
-        <w:t xml:space="preserve">RULE_RECURRING_EXPENDITURE   RULE_GRANT_LOAN</w:t>
-      </w:r>
-      <w:r>
-        <w:rPr>
-          <w:rFonts w:ascii="Consolas" w:cs="Consolas" w:eastAsia="Consolas" w:hAnsi="Consolas"/>
-          <w:color w:val="333333"/>
-          <w:sz w:val="18"/>
-          <w:szCs w:val="18"/>
-        </w:rPr>
-        <w:br/>
-        <w:t xml:space="preserve">RULE_UNAUTHORIZED_COLONY     RULE_ENTITLEMENT_EXCEEDED</w:t>
-      </w:r>
-      <w:r>
-        <w:rPr>
-          <w:rFonts w:ascii="Consolas" w:cs="Consolas" w:eastAsia="Consolas" w:hAnsi="Consolas"/>
-          <w:color w:val="333333"/>
-          <w:sz w:val="18"/>
-          <w:szCs w:val="18"/>
-        </w:rPr>
-        <w:br/>
-        <w:t xml:space="preserve">RULE_SANCTION_DELAY          RULE_COMPLETION_DELAY</w:t>
-      </w:r>
-      <w:r>
-        <w:rPr>
-          <w:rFonts w:ascii="Consolas" w:cs="Consolas" w:eastAsia="Consolas" w:hAnsi="Consolas"/>
-          <w:color w:val="333333"/>
-          <w:sz w:val="18"/>
-          <w:szCs w:val="18"/>
-        </w:rPr>
-        <w:br/>
-        <w:t xml:space="preserve">RULE_MISSING_APPROVAL        RULE_MISSING_AGENCY</w:t>
-      </w:r>
-      <w:r>
-        <w:rPr>
-          <w:rFonts w:ascii="Consolas" w:cs="Consolas" w:eastAsia="Consolas" w:hAnsi="Consolas"/>
-          <w:color w:val="333333"/>
-          <w:sz w:val="18"/>
-          <w:szCs w:val="18"/>
-        </w:rPr>
-        <w:br/>
-        <w:t xml:space="preserve">RULE_INVALID_MP_DISTRICT     RULE_FINANCIAL_INCONSISTENCY</w:t>
+        <w:t xml:space="preserve">Work descriptions -&gt; Text normalization -&gt; Candidate blocking</w:t>
+      </w:r>
+      <w:r>
+        <w:rPr>
+          <w:rFonts w:ascii="Consolas" w:cs="Consolas" w:eastAsia="Consolas" w:hAnsi="Consolas"/>
+          <w:color w:val="333333"/>
+          <w:sz w:val="18"/>
+          <w:szCs w:val="18"/>
+        </w:rPr>
+        <w:br/>
+        <w:t xml:space="preserve">-&gt; TF-IDF / n-gram similarity -&gt; Sentence Transformer re-rank</w:t>
+      </w:r>
+      <w:r>
+        <w:rPr>
+          <w:rFonts w:ascii="Consolas" w:cs="Consolas" w:eastAsia="Consolas" w:hAnsi="Consolas"/>
+          <w:color w:val="333333"/>
+          <w:sz w:val="18"/>
+          <w:szCs w:val="18"/>
+        </w:rPr>
+        <w:br/>
+        <w:t xml:space="preserve">-&gt; Multi-signal scoring (text/location/agency/amount/date)</w:t>
+      </w:r>
+      <w:r>
+        <w:rPr>
+          <w:rFonts w:ascii="Consolas" w:cs="Consolas" w:eastAsia="Consolas" w:hAnsi="Consolas"/>
+          <w:color w:val="333333"/>
+          <w:sz w:val="18"/>
+          <w:szCs w:val="18"/>
+        </w:rPr>
+        <w:br/>
+        <w:t xml:space="preserve">-&gt; Candidate duplicate -&gt; Human review</w:t>
       </w:r>
     </w:p>
     <w:p>
@@ -2192,7 +2243,7 @@
           <w:sz w:val="22"/>
           <w:szCs w:val="22"/>
         </w:rPr>
-        <w:t xml:space="preserve">compliance_flags</w:t>
+        <w:t xml:space="preserve">duplicate_candidates</w:t>
       </w:r>
     </w:p>
     <w:p>
@@ -2205,7 +2256,7 @@
         <w:spacing w:after="60"/>
       </w:pPr>
       <w:r>
-        <w:t xml:space="preserve">id, work_id, rule_id, triggered, severity, description, evidence</w:t>
+        <w:t xml:space="preserve">id, work_id, matched_work_id</w:t>
       </w:r>
     </w:p>
     <w:p>
@@ -2218,59 +2269,7 @@
         <w:spacing w:after="60"/>
       </w:pPr>
       <w:r>
-        <w:t xml:space="preserve">observed_value, expected_value, confidence, review_status, created_at</w:t>
-      </w:r>
-    </w:p>
-    <w:p>
-      <w:pPr>
-        <w:spacing w:after="120"/>
-      </w:pPr>
-      <w:r>
-        <w:rPr>
-          <w:b/>
-          <w:bCs/>
-        </w:rPr>
-        <w:t xml:space="preserve">Every flag is worded as “needs verification,” never as a legal finding.</w:t>
-      </w:r>
-    </w:p>
-    <w:p>
-      <w:pPr>
-        <w:pStyle w:val="Heading1"/>
-        <w:spacing w:after="160" w:before="360"/>
-      </w:pPr>
-      <w:r>
-        <w:rPr>
-          <w:b/>
-          <w:bCs/>
-          <w:color w:val="1F3864"/>
-          <w:sz w:val="30"/>
-          <w:szCs w:val="30"/>
-        </w:rPr>
-        <w:t xml:space="preserve">6. Detection Results — Unified Table</w:t>
-      </w:r>
-    </w:p>
-    <w:p>
-      <w:pPr>
-        <w:spacing w:after="120"/>
-      </w:pPr>
-      <w:r>
-        <w:t xml:space="preserve">Instead of five unrelated result tables, one unified table stores outputs from all engines:</w:t>
-      </w:r>
-    </w:p>
-    <w:p>
-      <w:pPr>
-        <w:pStyle w:val="Heading3"/>
-        <w:spacing w:after="100" w:before="200"/>
-      </w:pPr>
-      <w:r>
-        <w:rPr>
-          <w:b/>
-          <w:bCs/>
-          <w:color w:val="1F3864"/>
-          <w:sz w:val="22"/>
-          <w:szCs w:val="22"/>
-        </w:rPr>
-        <w:t xml:space="preserve">detection_results</w:t>
+        <w:t xml:space="preserve">text_similarity, location_similarity, agency_similarity, amount_similarity, date_similarity, overall_similarity</w:t>
       </w:r>
     </w:p>
     <w:p>
@@ -2283,7 +2282,41 @@
         <w:spacing w:after="60"/>
       </w:pPr>
       <w:r>
-        <w:t xml:space="preserve">id, work_id, engine_type, score, severity</w:t>
+        <w:t xml:space="preserve">reason, status (PENDING / CONFIRMED / REJECTED), reviewed_by, reviewed_at, created_at</w:t>
+      </w:r>
+    </w:p>
+    <w:p>
+      <w:pPr>
+        <w:pStyle w:val="Heading2"/>
+        <w:spacing w:after="120" w:before="260"/>
+      </w:pPr>
+      <w:r>
+        <w:rPr>
+          <w:b/>
+          <w:bCs/>
+          <w:color w:val="2E5C8A"/>
+          <w:sz w:val="25"/>
+          <w:szCs w:val="25"/>
+        </w:rPr>
+        <w:t xml:space="preserve">5.4 Fund-Flow Anomaly Engine</w:t>
+      </w:r>
+      <w:r>
+        <w:rPr>
+          <w:b/>
+          <w:bCs/>
+          <w:color w:val="1D6B33"/>
+          <w:sz w:val="18"/>
+          <w:szCs w:val="18"/>
+        </w:rPr>
+        <w:t xml:space="preserve">  [LOCKED BY SYSTEM DESIGN]</w:t>
+      </w:r>
+    </w:p>
+    <w:p>
+      <w:pPr>
+        <w:spacing w:after="120"/>
+      </w:pPr>
+      <w:r>
+        <w:t xml:space="preserve">A first-class backend module, not folded into the delay detector.</w:t>
       </w:r>
     </w:p>
     <w:p>
@@ -2296,7 +2329,7 @@
         <w:spacing w:after="60"/>
       </w:pPr>
       <w:r>
-        <w:t xml:space="preserve">reason_code, description, evidence, confidence, model_version, created_at</w:t>
+        <w:t xml:space="preserve">released_amount &gt; sanction_amount</w:t>
       </w:r>
     </w:p>
     <w:p>
@@ -2309,23 +2342,143 @@
         <w:spacing w:after="60"/>
       </w:pPr>
       <w:r>
-        <w:t xml:space="preserve">engine_type values: COST, DUPLICATE, DELAY, FUND_FLOW, COMPLIANCE</w:t>
-      </w:r>
-    </w:p>
-    <w:p>
-      <w:pPr>
-        <w:pStyle w:val="Heading1"/>
-        <w:spacing w:after="160" w:before="360"/>
+        <w:t xml:space="preserve">high released percentage vs low/unchanged recorded progress (payment–progress mismatch)</w:t>
+      </w:r>
+    </w:p>
+    <w:p>
+      <w:pPr>
+        <w:pStyle w:val="ListParagraph"/>
+        <w:numPr>
+          <w:ilvl w:val="0"/>
+          <w:numId w:val="2"/>
+        </w:numPr>
+        <w:spacing w:after="60"/>
+      </w:pPr>
+      <w:r>
+        <w:t xml:space="preserve">repeated installment releases with no corresponding progress update</w:t>
+      </w:r>
+    </w:p>
+    <w:p>
+      <w:pPr>
+        <w:pStyle w:val="ListParagraph"/>
+        <w:numPr>
+          <w:ilvl w:val="0"/>
+          <w:numId w:val="2"/>
+        </w:numPr>
+        <w:spacing w:after="60"/>
+      </w:pPr>
+      <w:r>
+        <w:t xml:space="preserve">large release immediately after sanction</w:t>
+      </w:r>
+    </w:p>
+    <w:p>
+      <w:pPr>
+        <w:pStyle w:val="ListParagraph"/>
+        <w:numPr>
+          <w:ilvl w:val="0"/>
+          <w:numId w:val="2"/>
+        </w:numPr>
+        <w:spacing w:after="60"/>
+      </w:pPr>
+      <w:r>
+        <w:t xml:space="preserve">unspent funds with long inactivity</w:t>
+      </w:r>
+    </w:p>
+    <w:p>
+      <w:pPr>
+        <w:pStyle w:val="ListParagraph"/>
+        <w:numPr>
+          <w:ilvl w:val="0"/>
+          <w:numId w:val="2"/>
+        </w:numPr>
+        <w:spacing w:after="60"/>
+      </w:pPr>
+      <w:r>
+        <w:t xml:space="preserve">financial-year utilization anomaly / end-of-year spending concentration</w:t>
+      </w:r>
+    </w:p>
+    <w:p>
+      <w:pPr>
+        <w:pStyle w:val="ListParagraph"/>
+        <w:numPr>
+          <w:ilvl w:val="0"/>
+          <w:numId w:val="2"/>
+        </w:numPr>
+        <w:spacing w:after="60"/>
+      </w:pPr>
+      <w:r>
+        <w:t xml:space="preserve">sanction vs expenditure mismatch</w:t>
+      </w:r>
+    </w:p>
+    <w:p>
+      <w:pPr>
+        <w:pStyle w:val="ListParagraph"/>
+        <w:numPr>
+          <w:ilvl w:val="0"/>
+          <w:numId w:val="2"/>
+        </w:numPr>
+        <w:spacing w:after="60"/>
+      </w:pPr>
+      <w:r>
+        <w:t xml:space="preserve">identical payment patterns across works; payment concentration; completed work with incomplete financial closure</w:t>
+      </w:r>
+    </w:p>
+    <w:p>
+      <w:pPr>
+        <w:pStyle w:val="Heading3"/>
+        <w:spacing w:after="100" w:before="200"/>
       </w:pPr>
       <w:r>
         <w:rPr>
           <w:b/>
           <w:bCs/>
           <w:color w:val="1F3864"/>
-          <w:sz w:val="30"/>
-          <w:szCs w:val="30"/>
-        </w:rPr>
-        <w:t xml:space="preserve">7. Risk / Impact / Priority Engine</w:t>
+          <w:sz w:val="22"/>
+          <w:szCs w:val="22"/>
+        </w:rPr>
+        <w:t xml:space="preserve">fund_anomalies</w:t>
+      </w:r>
+    </w:p>
+    <w:p>
+      <w:pPr>
+        <w:pStyle w:val="ListParagraph"/>
+        <w:numPr>
+          <w:ilvl w:val="0"/>
+          <w:numId w:val="2"/>
+        </w:numPr>
+        <w:spacing w:after="60"/>
+      </w:pPr>
+      <w:r>
+        <w:t xml:space="preserve">id, work_id, anomaly_type, score, severity</w:t>
+      </w:r>
+    </w:p>
+    <w:p>
+      <w:pPr>
+        <w:pStyle w:val="ListParagraph"/>
+        <w:numPr>
+          <w:ilvl w:val="0"/>
+          <w:numId w:val="2"/>
+        </w:numPr>
+        <w:spacing w:after="60"/>
+      </w:pPr>
+      <w:r>
+        <w:t xml:space="preserve">expected_value, actual_value, amount_involved, reason_code, confidence, created_at</w:t>
+      </w:r>
+    </w:p>
+    <w:p>
+      <w:pPr>
+        <w:pStyle w:val="Heading2"/>
+        <w:spacing w:after="120" w:before="260"/>
+      </w:pPr>
+      <w:r>
+        <w:rPr>
+          <w:b/>
+          <w:bCs/>
+          <w:color w:val="2E5C8A"/>
+          <w:sz w:val="25"/>
+          <w:szCs w:val="25"/>
+        </w:rPr>
+        <w:t xml:space="preserve">5.5 Compliance Rules Engine</w:t>
       </w:r>
     </w:p>
     <w:p>
@@ -2333,7 +2486,49 @@
         <w:spacing w:after="120"/>
       </w:pPr>
       <w:r>
-        <w:t xml:space="preserve">The central aggregation layer. Each engine outputs a 0‑00 score, then:</w:t>
+        <w:t xml:space="preserve">Deterministic wherever possible — a policy layer, not a model trying to learn policy from data.</w:t>
+      </w:r>
+    </w:p>
+    <w:p>
+      <w:pPr>
+        <w:pStyle w:val="Heading3"/>
+        <w:spacing w:after="100" w:before="200"/>
+      </w:pPr>
+      <w:r>
+        <w:rPr>
+          <w:b/>
+          <w:bCs/>
+          <w:color w:val="1F3864"/>
+          <w:sz w:val="22"/>
+          <w:szCs w:val="22"/>
+        </w:rPr>
+        <w:t xml:space="preserve">compliance_rules (reference table)</w:t>
+      </w:r>
+    </w:p>
+    <w:p>
+      <w:pPr>
+        <w:pStyle w:val="ListParagraph"/>
+        <w:numPr>
+          <w:ilvl w:val="0"/>
+          <w:numId w:val="2"/>
+        </w:numPr>
+        <w:spacing w:after="60"/>
+      </w:pPr>
+      <w:r>
+        <w:t xml:space="preserve">rule_id, rule_name, rule_type, description, source_reference, severity, active</w:t>
+      </w:r>
+    </w:p>
+    <w:p>
+      <w:pPr>
+        <w:pStyle w:val="ListParagraph"/>
+        <w:numPr>
+          <w:ilvl w:val="0"/>
+          <w:numId w:val="2"/>
+        </w:numPr>
+        <w:spacing w:after="60"/>
+      </w:pPr>
+      <w:r>
+        <w:t xml:space="preserve">rule_type values: CATEGORY, TIMELINE, ENTITLEMENT, DATA_COMPLETENESS, FINANCIAL, RELATIONSHIP</w:t>
       </w:r>
     </w:p>
     <w:p>
@@ -2354,6 +2549,244 @@
           <w:sz w:val="18"/>
           <w:szCs w:val="18"/>
         </w:rPr>
+        <w:t xml:space="preserve">RULE_RELIGIOUS_WORK          RULE_LAND_ACQUISITION</w:t>
+      </w:r>
+      <w:r>
+        <w:rPr>
+          <w:rFonts w:ascii="Consolas" w:cs="Consolas" w:eastAsia="Consolas" w:hAnsi="Consolas"/>
+          <w:color w:val="333333"/>
+          <w:sz w:val="18"/>
+          <w:szCs w:val="18"/>
+        </w:rPr>
+        <w:br/>
+        <w:t xml:space="preserve">RULE_RESIDENTIAL_WORK        RULE_COMMERCIAL_WORK</w:t>
+      </w:r>
+      <w:r>
+        <w:rPr>
+          <w:rFonts w:ascii="Consolas" w:cs="Consolas" w:eastAsia="Consolas" w:hAnsi="Consolas"/>
+          <w:color w:val="333333"/>
+          <w:sz w:val="18"/>
+          <w:szCs w:val="18"/>
+        </w:rPr>
+        <w:br/>
+        <w:t xml:space="preserve">RULE_RECURRING_EXPENDITURE   RULE_GRANT_LOAN</w:t>
+      </w:r>
+      <w:r>
+        <w:rPr>
+          <w:rFonts w:ascii="Consolas" w:cs="Consolas" w:eastAsia="Consolas" w:hAnsi="Consolas"/>
+          <w:color w:val="333333"/>
+          <w:sz w:val="18"/>
+          <w:szCs w:val="18"/>
+        </w:rPr>
+        <w:br/>
+        <w:t xml:space="preserve">RULE_UNAUTHORIZED_COLONY     RULE_ENTITLEMENT_EXCEEDED</w:t>
+      </w:r>
+      <w:r>
+        <w:rPr>
+          <w:rFonts w:ascii="Consolas" w:cs="Consolas" w:eastAsia="Consolas" w:hAnsi="Consolas"/>
+          <w:color w:val="333333"/>
+          <w:sz w:val="18"/>
+          <w:szCs w:val="18"/>
+        </w:rPr>
+        <w:br/>
+        <w:t xml:space="preserve">RULE_SANCTION_DELAY          RULE_COMPLETION_DELAY</w:t>
+      </w:r>
+      <w:r>
+        <w:rPr>
+          <w:rFonts w:ascii="Consolas" w:cs="Consolas" w:eastAsia="Consolas" w:hAnsi="Consolas"/>
+          <w:color w:val="333333"/>
+          <w:sz w:val="18"/>
+          <w:szCs w:val="18"/>
+        </w:rPr>
+        <w:br/>
+        <w:t xml:space="preserve">RULE_MISSING_APPROVAL        RULE_MISSING_AGENCY</w:t>
+      </w:r>
+      <w:r>
+        <w:rPr>
+          <w:rFonts w:ascii="Consolas" w:cs="Consolas" w:eastAsia="Consolas" w:hAnsi="Consolas"/>
+          <w:color w:val="333333"/>
+          <w:sz w:val="18"/>
+          <w:szCs w:val="18"/>
+        </w:rPr>
+        <w:br/>
+        <w:t xml:space="preserve">RULE_INVALID_MP_DISTRICT     RULE_FINANCIAL_INCONSISTENCY</w:t>
+      </w:r>
+    </w:p>
+    <w:p>
+      <w:pPr>
+        <w:pStyle w:val="Heading3"/>
+        <w:spacing w:after="100" w:before="200"/>
+      </w:pPr>
+      <w:r>
+        <w:rPr>
+          <w:b/>
+          <w:bCs/>
+          <w:color w:val="1F3864"/>
+          <w:sz w:val="22"/>
+          <w:szCs w:val="22"/>
+        </w:rPr>
+        <w:t xml:space="preserve">compliance_flags</w:t>
+      </w:r>
+    </w:p>
+    <w:p>
+      <w:pPr>
+        <w:pStyle w:val="ListParagraph"/>
+        <w:numPr>
+          <w:ilvl w:val="0"/>
+          <w:numId w:val="2"/>
+        </w:numPr>
+        <w:spacing w:after="60"/>
+      </w:pPr>
+      <w:r>
+        <w:t xml:space="preserve">id, work_id, rule_id, triggered, severity, description, evidence</w:t>
+      </w:r>
+    </w:p>
+    <w:p>
+      <w:pPr>
+        <w:pStyle w:val="ListParagraph"/>
+        <w:numPr>
+          <w:ilvl w:val="0"/>
+          <w:numId w:val="2"/>
+        </w:numPr>
+        <w:spacing w:after="60"/>
+      </w:pPr>
+      <w:r>
+        <w:t xml:space="preserve">observed_value, expected_value, confidence, review_status, created_at</w:t>
+      </w:r>
+    </w:p>
+    <w:p>
+      <w:pPr>
+        <w:spacing w:after="120"/>
+      </w:pPr>
+      <w:r>
+        <w:rPr>
+          <w:b/>
+          <w:bCs/>
+        </w:rPr>
+        <w:t xml:space="preserve">Every flag is worded as “needs verification,” never as a legal finding.</w:t>
+      </w:r>
+    </w:p>
+    <w:p>
+      <w:pPr>
+        <w:pStyle w:val="Heading1"/>
+        <w:spacing w:after="160" w:before="360"/>
+      </w:pPr>
+      <w:r>
+        <w:rPr>
+          <w:b/>
+          <w:bCs/>
+          <w:color w:val="1F3864"/>
+          <w:sz w:val="30"/>
+          <w:szCs w:val="30"/>
+        </w:rPr>
+        <w:t xml:space="preserve">6. Detection Results — Unified Table</w:t>
+      </w:r>
+    </w:p>
+    <w:p>
+      <w:pPr>
+        <w:spacing w:after="120"/>
+      </w:pPr>
+      <w:r>
+        <w:t xml:space="preserve">Instead of five unrelated result tables, one unified table stores outputs from all engines:</w:t>
+      </w:r>
+    </w:p>
+    <w:p>
+      <w:pPr>
+        <w:pStyle w:val="Heading3"/>
+        <w:spacing w:after="100" w:before="200"/>
+      </w:pPr>
+      <w:r>
+        <w:rPr>
+          <w:b/>
+          <w:bCs/>
+          <w:color w:val="1F3864"/>
+          <w:sz w:val="22"/>
+          <w:szCs w:val="22"/>
+        </w:rPr>
+        <w:t xml:space="preserve">detection_results</w:t>
+      </w:r>
+    </w:p>
+    <w:p>
+      <w:pPr>
+        <w:pStyle w:val="ListParagraph"/>
+        <w:numPr>
+          <w:ilvl w:val="0"/>
+          <w:numId w:val="2"/>
+        </w:numPr>
+        <w:spacing w:after="60"/>
+      </w:pPr>
+      <w:r>
+        <w:t xml:space="preserve">id, work_id, engine_type, score, severity</w:t>
+      </w:r>
+    </w:p>
+    <w:p>
+      <w:pPr>
+        <w:pStyle w:val="ListParagraph"/>
+        <w:numPr>
+          <w:ilvl w:val="0"/>
+          <w:numId w:val="2"/>
+        </w:numPr>
+        <w:spacing w:after="60"/>
+      </w:pPr>
+      <w:r>
+        <w:t xml:space="preserve">reason_code, description, evidence, confidence, model_version, created_at</w:t>
+      </w:r>
+    </w:p>
+    <w:p>
+      <w:pPr>
+        <w:pStyle w:val="ListParagraph"/>
+        <w:numPr>
+          <w:ilvl w:val="0"/>
+          <w:numId w:val="2"/>
+        </w:numPr>
+        <w:spacing w:after="60"/>
+      </w:pPr>
+      <w:r>
+        <w:t xml:space="preserve">engine_type values: COST, DUPLICATE, DELAY, FUND_FLOW, COMPLIANCE</w:t>
+      </w:r>
+    </w:p>
+    <w:p>
+      <w:pPr>
+        <w:pStyle w:val="Heading1"/>
+        <w:spacing w:after="160" w:before="360"/>
+      </w:pPr>
+      <w:r>
+        <w:rPr>
+          <w:b/>
+          <w:bCs/>
+          <w:color w:val="1F3864"/>
+          <w:sz w:val="30"/>
+          <w:szCs w:val="30"/>
+        </w:rPr>
+        <w:t xml:space="preserve">7. Risk / Impact / Priority Engine</w:t>
+      </w:r>
+    </w:p>
+    <w:p>
+      <w:pPr>
+        <w:spacing w:after="120"/>
+      </w:pPr>
+      <w:r>
+        <w:t xml:space="preserve">The central aggregation layer, computed in Python and upserted into risk_scores via the service-role key after each batch run. Each engine outputs a 0–100 score, then:</w:t>
+      </w:r>
+    </w:p>
+    <w:p>
+      <w:pPr>
+        <w:pBdr>
+          <w:top w:val="single" w:color="CCCCCC" w:sz="2"/>
+          <w:bottom w:val="single" w:color="CCCCCC" w:sz="2"/>
+          <w:left w:val="single" w:color="CCCCCC" w:sz="2"/>
+          <w:right w:val="single" w:color="CCCCCC" w:sz="2"/>
+        </w:pBdr>
+        <w:shd w:fill="F5F5F5" w:val="clear"/>
+        <w:spacing w:after="160"/>
+      </w:pPr>
+      <w:r>
+        <w:rPr>
+          <w:rFonts w:ascii="Consolas" w:cs="Consolas" w:eastAsia="Consolas" w:hAnsi="Consolas"/>
+          <w:color w:val="333333"/>
+          <w:sz w:val="18"/>
+          <w:szCs w:val="18"/>
+        </w:rPr>
         <w:t xml:space="preserve">risk_score =</w:t>
       </w:r>
       <w:r>
@@ -2424,7 +2857,17 @@
           <w:szCs w:val="18"/>
         </w:rPr>
         <w:br/>
-        <w:t xml:space="preserve">(weights configurable per role via Settings &gt; Risk Configuration)</w:t>
+        <w:t xml:space="preserve">(weights read from a risk_weights table, configurable per role</w:t>
+      </w:r>
+      <w:r>
+        <w:rPr>
+          <w:rFonts w:ascii="Consolas" w:cs="Consolas" w:eastAsia="Consolas" w:hAnsi="Consolas"/>
+          <w:color w:val="333333"/>
+          <w:sz w:val="18"/>
+          <w:szCs w:val="18"/>
+        </w:rPr>
+        <w:br/>
+        <w:t xml:space="preserve"> via the risk-weights-update Edge Function)</w:t>
       </w:r>
     </w:p>
     <w:p>
@@ -2858,7 +3301,7 @@
         <w:spacing w:after="120"/>
       </w:pPr>
       <w:r>
-        <w:t xml:space="preserve">Backend additionally exposes an inspection_mandatory flag so works covered by mandated third-party inspection rules (≥ ₹25 lakh, ₹15–25 lakh band) surface separately from statistically-derived priority.</w:t>
+        <w:t xml:space="preserve">A boolean inspection_mandatory column additionally flags works covered by mandated third-party inspection rules (≥ ₹25 lakh, ₹15–25 lakh band), computed by the Compliance Rules Engine and stored directly on risk_scores or works so it can be filtered on without a join.</w:t>
       </w:r>
     </w:p>
     <w:p>
@@ -2882,7 +3325,7 @@
         <w:spacing w:after="120"/>
       </w:pPr>
       <w:r>
-        <w:t xml:space="preserve">Every risk result carries machine-readable reasons — this is the backend contract the Work Detail “Why flagged?” UI consumes directly:</w:t>
+        <w:t xml:space="preserve">Every risk result carries machine-readable reasons — this is the contract the Work Detail “Why flagged?” UI consumes directly:</w:t>
       </w:r>
     </w:p>
     <w:p>
@@ -3051,7 +3494,7 @@
         <w:spacing w:after="60"/>
       </w:pPr>
       <w:r>
-        <w:t xml:space="preserve">remarks, findings, evidence_references</w:t>
+        <w:t xml:space="preserve">remarks, findings, evidence_references (Supabase Storage object paths)</w:t>
       </w:r>
     </w:p>
     <w:p>
@@ -3140,7 +3583,7 @@
           <w:b/>
           <w:bCs/>
         </w:rPr>
-        <w:t xml:space="preserve">Every transition writes an audit_log record.</w:t>
+        <w:t xml:space="preserve">Every INSERT/UPDATE on inspections fires an AFTER trigger that writes to audit_log — the client cannot skip this by calling the API differently.</w:t>
       </w:r>
     </w:p>
     <w:p>
@@ -3219,11 +3662,45 @@
         <w:spacing w:after="120"/>
       </w:pPr>
       <w:r>
+        <w:t xml:space="preserve">Two write paths populate this table:</w:t>
+      </w:r>
+    </w:p>
+    <w:p>
+      <w:pPr>
+        <w:pStyle w:val="ListParagraph"/>
+        <w:numPr>
+          <w:ilvl w:val="0"/>
+          <w:numId w:val="2"/>
+        </w:numPr>
+        <w:spacing w:after="60"/>
+      </w:pPr>
+      <w:r>
+        <w:t xml:space="preserve">Postgres triggers on inspections and compliance_flags.review_status for straightforward status/decision changes.</w:t>
+      </w:r>
+    </w:p>
+    <w:p>
+      <w:pPr>
+        <w:pStyle w:val="ListParagraph"/>
+        <w:numPr>
+          <w:ilvl w:val="0"/>
+          <w:numId w:val="2"/>
+        </w:numPr>
+        <w:spacing w:after="60"/>
+      </w:pPr>
+      <w:r>
+        <w:t xml:space="preserve">Explicit inserts from Edge Functions (risk-weights-update, review-decision, evidence upload handler) for actions that need extra context (e.g. which fields changed, request metadata) beyond what a trigger can see.</w:t>
+      </w:r>
+    </w:p>
+    <w:p>
+      <w:pPr>
+        <w:spacing w:after="120"/>
+      </w:pPr>
+      <w:r>
         <w:rPr>
           <w:b/>
           <w:bCs/>
         </w:rPr>
-        <w:t xml:space="preserve">Sensitive operations must write to this table — not merely be “logged” informally.</w:t>
+        <w:t xml:space="preserve">Sensitive operations must always land here — never be “logged” only via application console output.</w:t>
       </w:r>
     </w:p>
     <w:p>
@@ -3239,7 +3716,280 @@
           <w:sz w:val="30"/>
           <w:szCs w:val="30"/>
         </w:rPr>
-        <w:t xml:space="preserve">10. Role-Based Access</w:t>
+        <w:t xml:space="preserve">10. Authorization — Row Level Security</w:t>
+      </w:r>
+    </w:p>
+    <w:p>
+      <w:pPr>
+        <w:spacing w:after="120"/>
+      </w:pPr>
+      <w:r>
+        <w:t xml:space="preserve">RLS replaces Spring Security's service-layer role checks. Every table has RLS enabled, and policies read the caller's role and scope from profiles (or from JWT custom claims, for performance).</w:t>
+      </w:r>
+    </w:p>
+    <w:p>
+      <w:pPr>
+        <w:pStyle w:val="Heading3"/>
+        <w:spacing w:after="100" w:before="200"/>
+      </w:pPr>
+      <w:r>
+        <w:rPr>
+          <w:b/>
+          <w:bCs/>
+          <w:color w:val="1F3864"/>
+          <w:sz w:val="22"/>
+          <w:szCs w:val="22"/>
+        </w:rPr>
+        <w:t xml:space="preserve">Example policy pattern — works table</w:t>
+      </w:r>
+    </w:p>
+    <w:p>
+      <w:pPr>
+        <w:pBdr>
+          <w:top w:val="single" w:color="CCCCCC" w:sz="2"/>
+          <w:bottom w:val="single" w:color="CCCCCC" w:sz="2"/>
+          <w:left w:val="single" w:color="CCCCCC" w:sz="2"/>
+          <w:right w:val="single" w:color="CCCCCC" w:sz="2"/>
+        </w:pBdr>
+        <w:shd w:fill="F5F5F5" w:val="clear"/>
+        <w:spacing w:after="160"/>
+      </w:pPr>
+      <w:r>
+        <w:rPr>
+          <w:rFonts w:ascii="Consolas" w:cs="Consolas" w:eastAsia="Consolas" w:hAnsi="Consolas"/>
+          <w:color w:val="333333"/>
+          <w:sz w:val="18"/>
+          <w:szCs w:val="18"/>
+        </w:rPr>
+        <w:t xml:space="preserve">-- Enable RLS</w:t>
+      </w:r>
+      <w:r>
+        <w:rPr>
+          <w:rFonts w:ascii="Consolas" w:cs="Consolas" w:eastAsia="Consolas" w:hAnsi="Consolas"/>
+          <w:color w:val="333333"/>
+          <w:sz w:val="18"/>
+          <w:szCs w:val="18"/>
+        </w:rPr>
+        <w:br/>
+        <w:t xml:space="preserve">alter table works enable row level security;</w:t>
+      </w:r>
+      <w:r>
+        <w:rPr>
+          <w:rFonts w:ascii="Consolas" w:cs="Consolas" w:eastAsia="Consolas" w:hAnsi="Consolas"/>
+          <w:color w:val="333333"/>
+          <w:sz w:val="18"/>
+          <w:szCs w:val="18"/>
+        </w:rPr>
+        <w:br/>
+        <w:t xml:space="preserve"/>
+      </w:r>
+      <w:r>
+        <w:rPr>
+          <w:rFonts w:ascii="Consolas" w:cs="Consolas" w:eastAsia="Consolas" w:hAnsi="Consolas"/>
+          <w:color w:val="333333"/>
+          <w:sz w:val="18"/>
+          <w:szCs w:val="18"/>
+        </w:rPr>
+        <w:br/>
+        <w:t xml:space="preserve">-- MPs see only works in their constituency</w:t>
+      </w:r>
+      <w:r>
+        <w:rPr>
+          <w:rFonts w:ascii="Consolas" w:cs="Consolas" w:eastAsia="Consolas" w:hAnsi="Consolas"/>
+          <w:color w:val="333333"/>
+          <w:sz w:val="18"/>
+          <w:szCs w:val="18"/>
+        </w:rPr>
+        <w:br/>
+        <w:t xml:space="preserve">create policy mp_scope on works for select</w:t>
+      </w:r>
+      <w:r>
+        <w:rPr>
+          <w:rFonts w:ascii="Consolas" w:cs="Consolas" w:eastAsia="Consolas" w:hAnsi="Consolas"/>
+          <w:color w:val="333333"/>
+          <w:sz w:val="18"/>
+          <w:szCs w:val="18"/>
+        </w:rPr>
+        <w:br/>
+        <w:t xml:space="preserve">using (</w:t>
+      </w:r>
+      <w:r>
+        <w:rPr>
+          <w:rFonts w:ascii="Consolas" w:cs="Consolas" w:eastAsia="Consolas" w:hAnsi="Consolas"/>
+          <w:color w:val="333333"/>
+          <w:sz w:val="18"/>
+          <w:szCs w:val="18"/>
+        </w:rPr>
+        <w:br/>
+        <w:t xml:space="preserve">  exists (</w:t>
+      </w:r>
+      <w:r>
+        <w:rPr>
+          <w:rFonts w:ascii="Consolas" w:cs="Consolas" w:eastAsia="Consolas" w:hAnsi="Consolas"/>
+          <w:color w:val="333333"/>
+          <w:sz w:val="18"/>
+          <w:szCs w:val="18"/>
+        </w:rPr>
+        <w:br/>
+        <w:t xml:space="preserve">    select 1 from profiles p</w:t>
+      </w:r>
+      <w:r>
+        <w:rPr>
+          <w:rFonts w:ascii="Consolas" w:cs="Consolas" w:eastAsia="Consolas" w:hAnsi="Consolas"/>
+          <w:color w:val="333333"/>
+          <w:sz w:val="18"/>
+          <w:szCs w:val="18"/>
+        </w:rPr>
+        <w:br/>
+        <w:t xml:space="preserve">    where p.id = auth.uid()</w:t>
+      </w:r>
+      <w:r>
+        <w:rPr>
+          <w:rFonts w:ascii="Consolas" w:cs="Consolas" w:eastAsia="Consolas" w:hAnsi="Consolas"/>
+          <w:color w:val="333333"/>
+          <w:sz w:val="18"/>
+          <w:szCs w:val="18"/>
+        </w:rPr>
+        <w:br/>
+        <w:t xml:space="preserve">      and p.role = 'MP'</w:t>
+      </w:r>
+      <w:r>
+        <w:rPr>
+          <w:rFonts w:ascii="Consolas" w:cs="Consolas" w:eastAsia="Consolas" w:hAnsi="Consolas"/>
+          <w:color w:val="333333"/>
+          <w:sz w:val="18"/>
+          <w:szCs w:val="18"/>
+        </w:rPr>
+        <w:br/>
+        <w:t xml:space="preserve">      and p.constituency_id = works.constituency_id</w:t>
+      </w:r>
+      <w:r>
+        <w:rPr>
+          <w:rFonts w:ascii="Consolas" w:cs="Consolas" w:eastAsia="Consolas" w:hAnsi="Consolas"/>
+          <w:color w:val="333333"/>
+          <w:sz w:val="18"/>
+          <w:szCs w:val="18"/>
+        </w:rPr>
+        <w:br/>
+        <w:t xml:space="preserve">  )</w:t>
+      </w:r>
+      <w:r>
+        <w:rPr>
+          <w:rFonts w:ascii="Consolas" w:cs="Consolas" w:eastAsia="Consolas" w:hAnsi="Consolas"/>
+          <w:color w:val="333333"/>
+          <w:sz w:val="18"/>
+          <w:szCs w:val="18"/>
+        </w:rPr>
+        <w:br/>
+        <w:t xml:space="preserve">  or exists ( -- district/state/mospi roles: broader scope checks</w:t>
+      </w:r>
+      <w:r>
+        <w:rPr>
+          <w:rFonts w:ascii="Consolas" w:cs="Consolas" w:eastAsia="Consolas" w:hAnsi="Consolas"/>
+          <w:color w:val="333333"/>
+          <w:sz w:val="18"/>
+          <w:szCs w:val="18"/>
+        </w:rPr>
+        <w:br/>
+        <w:t xml:space="preserve">    select 1 from profiles p</w:t>
+      </w:r>
+      <w:r>
+        <w:rPr>
+          <w:rFonts w:ascii="Consolas" w:cs="Consolas" w:eastAsia="Consolas" w:hAnsi="Consolas"/>
+          <w:color w:val="333333"/>
+          <w:sz w:val="18"/>
+          <w:szCs w:val="18"/>
+        </w:rPr>
+        <w:br/>
+        <w:t xml:space="preserve">    where p.id = auth.uid()</w:t>
+      </w:r>
+      <w:r>
+        <w:rPr>
+          <w:rFonts w:ascii="Consolas" w:cs="Consolas" w:eastAsia="Consolas" w:hAnsi="Consolas"/>
+          <w:color w:val="333333"/>
+          <w:sz w:val="18"/>
+          <w:szCs w:val="18"/>
+        </w:rPr>
+        <w:br/>
+        <w:t xml:space="preserve">      and p.role in ('district_officer','state_admin','mospi_admin')</w:t>
+      </w:r>
+      <w:r>
+        <w:rPr>
+          <w:rFonts w:ascii="Consolas" w:cs="Consolas" w:eastAsia="Consolas" w:hAnsi="Consolas"/>
+          <w:color w:val="333333"/>
+          <w:sz w:val="18"/>
+          <w:szCs w:val="18"/>
+        </w:rPr>
+        <w:br/>
+        <w:t xml:space="preserve">      and (</w:t>
+      </w:r>
+      <w:r>
+        <w:rPr>
+          <w:rFonts w:ascii="Consolas" w:cs="Consolas" w:eastAsia="Consolas" w:hAnsi="Consolas"/>
+          <w:color w:val="333333"/>
+          <w:sz w:val="18"/>
+          <w:szCs w:val="18"/>
+        </w:rPr>
+        <w:br/>
+        <w:t xml:space="preserve">        p.role = 'mospi_admin'</w:t>
+      </w:r>
+      <w:r>
+        <w:rPr>
+          <w:rFonts w:ascii="Consolas" w:cs="Consolas" w:eastAsia="Consolas" w:hAnsi="Consolas"/>
+          <w:color w:val="333333"/>
+          <w:sz w:val="18"/>
+          <w:szCs w:val="18"/>
+        </w:rPr>
+        <w:br/>
+        <w:t xml:space="preserve">        or (p.role = 'state_admin' and p.state_id = works.state_id)</w:t>
+      </w:r>
+      <w:r>
+        <w:rPr>
+          <w:rFonts w:ascii="Consolas" w:cs="Consolas" w:eastAsia="Consolas" w:hAnsi="Consolas"/>
+          <w:color w:val="333333"/>
+          <w:sz w:val="18"/>
+          <w:szCs w:val="18"/>
+        </w:rPr>
+        <w:br/>
+        <w:t xml:space="preserve">        or (p.role = 'district_officer' and p.district_id = works.implementing_district)</w:t>
+      </w:r>
+      <w:r>
+        <w:rPr>
+          <w:rFonts w:ascii="Consolas" w:cs="Consolas" w:eastAsia="Consolas" w:hAnsi="Consolas"/>
+          <w:color w:val="333333"/>
+          <w:sz w:val="18"/>
+          <w:szCs w:val="18"/>
+        </w:rPr>
+        <w:br/>
+        <w:t xml:space="preserve">      )</w:t>
+      </w:r>
+      <w:r>
+        <w:rPr>
+          <w:rFonts w:ascii="Consolas" w:cs="Consolas" w:eastAsia="Consolas" w:hAnsi="Consolas"/>
+          <w:color w:val="333333"/>
+          <w:sz w:val="18"/>
+          <w:szCs w:val="18"/>
+        </w:rPr>
+        <w:br/>
+        <w:t xml:space="preserve">  )</w:t>
+      </w:r>
+      <w:r>
+        <w:rPr>
+          <w:rFonts w:ascii="Consolas" w:cs="Consolas" w:eastAsia="Consolas" w:hAnsi="Consolas"/>
+          <w:color w:val="333333"/>
+          <w:sz w:val="18"/>
+          <w:szCs w:val="18"/>
+        </w:rPr>
+        <w:br/>
+        <w:t xml:space="preserve">);</w:t>
+      </w:r>
+    </w:p>
+    <w:p>
+      <w:pPr>
+        <w:spacing w:after="120"/>
+      </w:pPr>
+      <w:r>
+        <w:t xml:space="preserve">The same pattern (scoped SELECT, restricted INSERT/UPDATE) is applied to fund_releases, detection_results, risk_scores, compliance_flags, inspections, and audit_log — joined back to works or profiles as needed. Writes to compliance_rules and risk_weights are restricted to state_admin / mospi_admin only.</w:t>
       </w:r>
     </w:p>
     <w:tbl>
@@ -3510,26 +4260,6 @@
     </w:tbl>
     <w:p>
       <w:pPr>
-        <w:spacing w:after="0" w:before="160"/>
-      </w:pPr>
-    </w:p>
-    <w:p>
-      <w:pPr>
-        <w:spacing w:after="120"/>
-      </w:pPr>
-      <w:r>
-        <w:rPr>
-          <w:i/>
-          <w:iCs/>
-          <w:color w:val="666666"/>
-          <w:sz w:val="20"/>
-          <w:szCs w:val="20"/>
-        </w:rPr>
-        <w:t xml:space="preserve">Enforced in Spring Security at the API/service level: constituency filtering for MPs, district filtering for district officers, state/national access for state/MoSPI admins.</w:t>
-      </w:r>
-    </w:p>
-    <w:p>
-      <w:pPr>
         <w:pStyle w:val="Heading1"/>
         <w:spacing w:after="160" w:before="360"/>
       </w:pPr>
@@ -3542,6 +4272,14 @@
           <w:szCs w:val="30"/>
         </w:rPr>
         <w:t xml:space="preserve">11. API Specification</w:t>
+      </w:r>
+    </w:p>
+    <w:p>
+      <w:pPr>
+        <w:spacing w:after="120"/>
+      </w:pPr>
+      <w:r>
+        <w:t xml:space="preserve">Reads use PostgREST directly against RLS-scoped tables/views via supabase-js. Composite reads and all writes with side effects (audit logging, role checks beyond RLS) go through Postgres RPC functions or Edge Functions.</w:t>
       </w:r>
     </w:p>
     <w:p>
@@ -3578,7 +4316,53 @@
           <w:sz w:val="18"/>
           <w:szCs w:val="18"/>
         </w:rPr>
-        <w:t xml:space="preserve">POST /auth/login</w:t>
+        <w:t xml:space="preserve">const { data, error } = await supabase.auth.signInWithPassword({</w:t>
+      </w:r>
+      <w:r>
+        <w:rPr>
+          <w:rFonts w:ascii="Consolas" w:cs="Consolas" w:eastAsia="Consolas" w:hAnsi="Consolas"/>
+          <w:color w:val="333333"/>
+          <w:sz w:val="18"/>
+          <w:szCs w:val="18"/>
+        </w:rPr>
+        <w:br/>
+        <w:t xml:space="preserve">  email, password</w:t>
+      </w:r>
+      <w:r>
+        <w:rPr>
+          <w:rFonts w:ascii="Consolas" w:cs="Consolas" w:eastAsia="Consolas" w:hAnsi="Consolas"/>
+          <w:color w:val="333333"/>
+          <w:sz w:val="18"/>
+          <w:szCs w:val="18"/>
+        </w:rPr>
+        <w:br/>
+        <w:t xml:space="preserve">});</w:t>
+      </w:r>
+      <w:r>
+        <w:rPr>
+          <w:rFonts w:ascii="Consolas" w:cs="Consolas" w:eastAsia="Consolas" w:hAnsi="Consolas"/>
+          <w:color w:val="333333"/>
+          <w:sz w:val="18"/>
+          <w:szCs w:val="18"/>
+        </w:rPr>
+        <w:br/>
+        <w:t xml:space="preserve">// data.session.user, data.session.access_token (JWT w/ role claim)</w:t>
+      </w:r>
+    </w:p>
+    <w:p>
+      <w:pPr>
+        <w:pStyle w:val="Heading3"/>
+        <w:spacing w:after="100" w:before="200"/>
+      </w:pPr>
+      <w:r>
+        <w:rPr>
+          <w:b/>
+          <w:bCs/>
+          <w:color w:val="1F3864"/>
+          <w:sz w:val="22"/>
+          <w:szCs w:val="22"/>
+        </w:rPr>
+        <w:t xml:space="preserve">Works (PostgREST, RLS-scoped automatically)</w:t>
       </w:r>
     </w:p>
     <w:p>
@@ -3599,23 +4383,47 @@
           <w:sz w:val="18"/>
           <w:szCs w:val="18"/>
         </w:rPr>
-        <w:t xml:space="preserve">{ "token": "...", "user": { "id": 1, "name": "Officer", "role": "district_officer" } }</w:t>
-      </w:r>
-    </w:p>
-    <w:p>
-      <w:pPr>
-        <w:pStyle w:val="Heading3"/>
-        <w:spacing w:after="100" w:before="200"/>
-      </w:pPr>
-      <w:r>
-        <w:rPr>
-          <w:b/>
-          <w:bCs/>
-          <w:color w:val="1F3864"/>
-          <w:sz w:val="22"/>
-          <w:szCs w:val="22"/>
-        </w:rPr>
-        <w:t xml:space="preserve">Works</w:t>
+        <w:t xml:space="preserve">supabase.from('works')</w:t>
+      </w:r>
+      <w:r>
+        <w:rPr>
+          <w:rFonts w:ascii="Consolas" w:cs="Consolas" w:eastAsia="Consolas" w:hAnsi="Consolas"/>
+          <w:color w:val="333333"/>
+          <w:sz w:val="18"/>
+          <w:szCs w:val="18"/>
+        </w:rPr>
+        <w:br/>
+        <w:t xml:space="preserve">  .select('*')</w:t>
+      </w:r>
+      <w:r>
+        <w:rPr>
+          <w:rFonts w:ascii="Consolas" w:cs="Consolas" w:eastAsia="Consolas" w:hAnsi="Consolas"/>
+          <w:color w:val="333333"/>
+          <w:sz w:val="18"/>
+          <w:szCs w:val="18"/>
+        </w:rPr>
+        <w:br/>
+        <w:t xml:space="preserve">  .eq('district_id', districtId)</w:t>
+      </w:r>
+      <w:r>
+        <w:rPr>
+          <w:rFonts w:ascii="Consolas" w:cs="Consolas" w:eastAsia="Consolas" w:hAnsi="Consolas"/>
+          <w:color w:val="333333"/>
+          <w:sz w:val="18"/>
+          <w:szCs w:val="18"/>
+        </w:rPr>
+        <w:br/>
+        <w:t xml:space="preserve">  .eq('risk_level', 'HIGH')</w:t>
+      </w:r>
+      <w:r>
+        <w:rPr>
+          <w:rFonts w:ascii="Consolas" w:cs="Consolas" w:eastAsia="Consolas" w:hAnsi="Consolas"/>
+          <w:color w:val="333333"/>
+          <w:sz w:val="18"/>
+          <w:szCs w:val="18"/>
+        </w:rPr>
+        <w:br/>
+        <w:t xml:space="preserve">  .order('priority_score', { ascending: false })</w:t>
       </w:r>
     </w:p>
     <w:p>
@@ -3636,27 +4444,7 @@
           <w:sz w:val="18"/>
           <w:szCs w:val="18"/>
         </w:rPr>
-        <w:t xml:space="preserve">GET /works?constituencyId=&amp;districtId=&amp;stateId=&amp;riskLevel=&amp;priority=</w:t>
-      </w:r>
-      <w:r>
-        <w:rPr>
-          <w:rFonts w:ascii="Consolas" w:cs="Consolas" w:eastAsia="Consolas" w:hAnsi="Consolas"/>
-          <w:color w:val="333333"/>
-          <w:sz w:val="18"/>
-          <w:szCs w:val="18"/>
-        </w:rPr>
-        <w:br/>
-        <w:t xml:space="preserve">    &amp;status=&amp;agency=&amp;financialYear=&amp;category=</w:t>
-      </w:r>
-      <w:r>
-        <w:rPr>
-          <w:rFonts w:ascii="Consolas" w:cs="Consolas" w:eastAsia="Consolas" w:hAnsi="Consolas"/>
-          <w:color w:val="333333"/>
-          <w:sz w:val="18"/>
-          <w:szCs w:val="18"/>
-        </w:rPr>
-        <w:br/>
-        <w:t xml:space="preserve">GET /works/{workId}</w:t>
+        <w:t xml:space="preserve">supabase.from('works').select('*').eq('id', workId).single()</w:t>
       </w:r>
     </w:p>
     <w:p>
@@ -3672,7 +4460,7 @@
           <w:sz w:val="22"/>
           <w:szCs w:val="22"/>
         </w:rPr>
-        <w:t xml:space="preserve">Work Intelligence</w:t>
+        <w:t xml:space="preserve">Work Intelligence (PostgREST against child tables/views)</w:t>
       </w:r>
     </w:p>
     <w:p>
@@ -3693,47 +4481,47 @@
           <w:sz w:val="18"/>
           <w:szCs w:val="18"/>
         </w:rPr>
-        <w:t xml:space="preserve">GET /works/{workId}/risk</w:t>
-      </w:r>
-      <w:r>
-        <w:rPr>
-          <w:rFonts w:ascii="Consolas" w:cs="Consolas" w:eastAsia="Consolas" w:hAnsi="Consolas"/>
-          <w:color w:val="333333"/>
-          <w:sz w:val="18"/>
-          <w:szCs w:val="18"/>
-        </w:rPr>
-        <w:br/>
-        <w:t xml:space="preserve">GET /works/{workId}/compliance</w:t>
-      </w:r>
-      <w:r>
-        <w:rPr>
-          <w:rFonts w:ascii="Consolas" w:cs="Consolas" w:eastAsia="Consolas" w:hAnsi="Consolas"/>
-          <w:color w:val="333333"/>
-          <w:sz w:val="18"/>
-          <w:szCs w:val="18"/>
-        </w:rPr>
-        <w:br/>
-        <w:t xml:space="preserve">GET /works/{workId}/fund-flow</w:t>
-      </w:r>
-      <w:r>
-        <w:rPr>
-          <w:rFonts w:ascii="Consolas" w:cs="Consolas" w:eastAsia="Consolas" w:hAnsi="Consolas"/>
-          <w:color w:val="333333"/>
-          <w:sz w:val="18"/>
-          <w:szCs w:val="18"/>
-        </w:rPr>
-        <w:br/>
-        <w:t xml:space="preserve">GET /works/{workId}/lifecycle</w:t>
-      </w:r>
-      <w:r>
-        <w:rPr>
-          <w:rFonts w:ascii="Consolas" w:cs="Consolas" w:eastAsia="Consolas" w:hAnsi="Consolas"/>
-          <w:color w:val="333333"/>
-          <w:sz w:val="18"/>
-          <w:szCs w:val="18"/>
-        </w:rPr>
-        <w:br/>
-        <w:t xml:space="preserve">GET /duplicates/{workId}</w:t>
+        <w:t xml:space="preserve">supabase.from('risk_scores').select('*').eq('work_id', workId).single()</w:t>
+      </w:r>
+      <w:r>
+        <w:rPr>
+          <w:rFonts w:ascii="Consolas" w:cs="Consolas" w:eastAsia="Consolas" w:hAnsi="Consolas"/>
+          <w:color w:val="333333"/>
+          <w:sz w:val="18"/>
+          <w:szCs w:val="18"/>
+        </w:rPr>
+        <w:br/>
+        <w:t xml:space="preserve">supabase.from('compliance_flags').select('*, compliance_rules(*)').eq('work_id', workId)</w:t>
+      </w:r>
+      <w:r>
+        <w:rPr>
+          <w:rFonts w:ascii="Consolas" w:cs="Consolas" w:eastAsia="Consolas" w:hAnsi="Consolas"/>
+          <w:color w:val="333333"/>
+          <w:sz w:val="18"/>
+          <w:szCs w:val="18"/>
+        </w:rPr>
+        <w:br/>
+        <w:t xml:space="preserve">supabase.from('fund_releases').select('*').eq('work_id', workId).order('release_date')</w:t>
+      </w:r>
+      <w:r>
+        <w:rPr>
+          <w:rFonts w:ascii="Consolas" w:cs="Consolas" w:eastAsia="Consolas" w:hAnsi="Consolas"/>
+          <w:color w:val="333333"/>
+          <w:sz w:val="18"/>
+          <w:szCs w:val="18"/>
+        </w:rPr>
+        <w:br/>
+        <w:t xml:space="preserve">supabase.from('duplicate_candidates').select('*').eq('work_id', workId)</w:t>
+      </w:r>
+      <w:r>
+        <w:rPr>
+          <w:rFonts w:ascii="Consolas" w:cs="Consolas" w:eastAsia="Consolas" w:hAnsi="Consolas"/>
+          <w:color w:val="333333"/>
+          <w:sz w:val="18"/>
+          <w:szCs w:val="18"/>
+        </w:rPr>
+        <w:br/>
+        <w:t xml:space="preserve">supabase.rpc('get_work_lifecycle', { p_work_id: workId })</w:t>
       </w:r>
     </w:p>
     <w:p>
@@ -3749,7 +4537,7 @@
           <w:sz w:val="22"/>
           <w:szCs w:val="22"/>
         </w:rPr>
-        <w:t xml:space="preserve">Inspection</w:t>
+        <w:t xml:space="preserve">Inspection (RPC / PostgREST)</w:t>
       </w:r>
     </w:p>
     <w:p>
@@ -3770,27 +4558,37 @@
           <w:sz w:val="18"/>
           <w:szCs w:val="18"/>
         </w:rPr>
-        <w:t xml:space="preserve">GET  /inspections/priority?scope=</w:t>
-      </w:r>
-      <w:r>
-        <w:rPr>
-          <w:rFonts w:ascii="Consolas" w:cs="Consolas" w:eastAsia="Consolas" w:hAnsi="Consolas"/>
-          <w:color w:val="333333"/>
-          <w:sz w:val="18"/>
-          <w:szCs w:val="18"/>
-        </w:rPr>
-        <w:br/>
-        <w:t xml:space="preserve">POST /inspections</w:t>
-      </w:r>
-      <w:r>
-        <w:rPr>
-          <w:rFonts w:ascii="Consolas" w:cs="Consolas" w:eastAsia="Consolas" w:hAnsi="Consolas"/>
-          <w:color w:val="333333"/>
-          <w:sz w:val="18"/>
-          <w:szCs w:val="18"/>
-        </w:rPr>
-        <w:br/>
-        <w:t xml:space="preserve">PUT  /inspections/{inspectionId}</w:t>
+        <w:t xml:space="preserve">supabase.rpc('get_inspection_priority', { p_scope: scope })</w:t>
+      </w:r>
+      <w:r>
+        <w:rPr>
+          <w:rFonts w:ascii="Consolas" w:cs="Consolas" w:eastAsia="Consolas" w:hAnsi="Consolas"/>
+          <w:color w:val="333333"/>
+          <w:sz w:val="18"/>
+          <w:szCs w:val="18"/>
+        </w:rPr>
+        <w:br/>
+        <w:t xml:space="preserve">supabase.from('inspections').insert({ work_id, assigned_to })</w:t>
+      </w:r>
+      <w:r>
+        <w:rPr>
+          <w:rFonts w:ascii="Consolas" w:cs="Consolas" w:eastAsia="Consolas" w:hAnsi="Consolas"/>
+          <w:color w:val="333333"/>
+          <w:sz w:val="18"/>
+          <w:szCs w:val="18"/>
+        </w:rPr>
+        <w:br/>
+        <w:t xml:space="preserve">supabase.from('inspections').update({ status, review_decision, remarks })</w:t>
+      </w:r>
+      <w:r>
+        <w:rPr>
+          <w:rFonts w:ascii="Consolas" w:cs="Consolas" w:eastAsia="Consolas" w:hAnsi="Consolas"/>
+          <w:color w:val="333333"/>
+          <w:sz w:val="18"/>
+          <w:szCs w:val="18"/>
+        </w:rPr>
+        <w:br/>
+        <w:t xml:space="preserve">  .eq('id', inspectionId)</w:t>
       </w:r>
     </w:p>
     <w:p>
@@ -3811,6 +4609,16 @@
           <w:sz w:val="18"/>
           <w:szCs w:val="18"/>
         </w:rPr>
+        <w:t xml:space="preserve">// get_inspection_priority(scope) returns:</w:t>
+      </w:r>
+      <w:r>
+        <w:rPr>
+          <w:rFonts w:ascii="Consolas" w:cs="Consolas" w:eastAsia="Consolas" w:hAnsi="Consolas"/>
+          <w:color w:val="333333"/>
+          <w:sz w:val="18"/>
+          <w:szCs w:val="18"/>
+        </w:rPr>
+        <w:br/>
         <w:t xml:space="preserve">{</w:t>
       </w:r>
       <w:r>
@@ -3867,7 +4675,7 @@
           <w:sz w:val="22"/>
           <w:szCs w:val="22"/>
         </w:rPr>
-        <w:t xml:space="preserve">Data Quality</w:t>
+        <w:t xml:space="preserve">Data Quality (RPC)</w:t>
       </w:r>
     </w:p>
     <w:p>
@@ -3888,7 +4696,7 @@
           <w:sz w:val="18"/>
           <w:szCs w:val="18"/>
         </w:rPr>
-        <w:t xml:space="preserve">GET /data-quality/summary?scope=</w:t>
+        <w:t xml:space="preserve">supabase.rpc('get_data_quality_summary', { p_scope: scope })</w:t>
       </w:r>
     </w:p>
     <w:p>
@@ -3965,7 +4773,7 @@
           <w:sz w:val="22"/>
           <w:szCs w:val="22"/>
         </w:rPr>
-        <w:t xml:space="preserve">Audit</w:t>
+        <w:t xml:space="preserve">Audit (PostgREST, RLS-scoped to authorized roles)</w:t>
       </w:r>
     </w:p>
     <w:p>
@@ -3986,7 +4794,27 @@
           <w:sz w:val="18"/>
           <w:szCs w:val="18"/>
         </w:rPr>
-        <w:t xml:space="preserve">GET /audit-log?scope=district:12&amp;from=2026-09-01&amp;to=2026-09-08</w:t>
+        <w:t xml:space="preserve">supabase.from('audit_log')</w:t>
+      </w:r>
+      <w:r>
+        <w:rPr>
+          <w:rFonts w:ascii="Consolas" w:cs="Consolas" w:eastAsia="Consolas" w:hAnsi="Consolas"/>
+          <w:color w:val="333333"/>
+          <w:sz w:val="18"/>
+          <w:szCs w:val="18"/>
+        </w:rPr>
+        <w:br/>
+        <w:t xml:space="preserve">  .select('*')</w:t>
+      </w:r>
+      <w:r>
+        <w:rPr>
+          <w:rFonts w:ascii="Consolas" w:cs="Consolas" w:eastAsia="Consolas" w:hAnsi="Consolas"/>
+          <w:color w:val="333333"/>
+          <w:sz w:val="18"/>
+          <w:szCs w:val="18"/>
+        </w:rPr>
+        <w:br/>
+        <w:t xml:space="preserve">  .gte('timestamp', from).lte('timestamp', to)</w:t>
       </w:r>
     </w:p>
     <w:p>
@@ -4002,7 +4830,7 @@
           <w:sz w:val="22"/>
           <w:szCs w:val="22"/>
         </w:rPr>
-        <w:t xml:space="preserve">Risk Configuration</w:t>
+        <w:t xml:space="preserve">Risk Configuration (Edge Function — role-gated + audit-logged)</w:t>
       </w:r>
     </w:p>
     <w:p>
@@ -4023,7 +4851,51 @@
           <w:sz w:val="18"/>
           <w:szCs w:val="18"/>
         </w:rPr>
-        <w:t xml:space="preserve">GET/PUT /settings/risk-weights</w:t>
+        <w:t xml:space="preserve">supabase.functions.invoke('risk-weights-update', {</w:t>
+      </w:r>
+      <w:r>
+        <w:rPr>
+          <w:rFonts w:ascii="Consolas" w:cs="Consolas" w:eastAsia="Consolas" w:hAnsi="Consolas"/>
+          <w:color w:val="333333"/>
+          <w:sz w:val="18"/>
+          <w:szCs w:val="18"/>
+        </w:rPr>
+        <w:br/>
+        <w:t xml:space="preserve">  body: { cost: 0.30, delay: 0.25, fund: 0.20, duplicate: 0.15, compliance: 0.10 }</w:t>
+      </w:r>
+      <w:r>
+        <w:rPr>
+          <w:rFonts w:ascii="Consolas" w:cs="Consolas" w:eastAsia="Consolas" w:hAnsi="Consolas"/>
+          <w:color w:val="333333"/>
+          <w:sz w:val="18"/>
+          <w:szCs w:val="18"/>
+        </w:rPr>
+        <w:br/>
+        <w:t xml:space="preserve">})</w:t>
+      </w:r>
+    </w:p>
+    <w:p>
+      <w:pPr>
+        <w:spacing w:after="120"/>
+      </w:pPr>
+      <w:r>
+        <w:t xml:space="preserve">The Edge Function verifies the caller's role from the JWT (state_admin / mospi_admin only), writes risk_weights, and inserts a RISK_CONFIG_CHANGE row into audit_log — all server-side, so this cannot be done with a plain table write even by a client that ignores RLS hints in the UI.</w:t>
+      </w:r>
+    </w:p>
+    <w:p>
+      <w:pPr>
+        <w:pStyle w:val="Heading3"/>
+        <w:spacing w:after="100" w:before="200"/>
+      </w:pPr>
+      <w:r>
+        <w:rPr>
+          <w:b/>
+          <w:bCs/>
+          <w:color w:val="1F3864"/>
+          <w:sz w:val="22"/>
+          <w:szCs w:val="22"/>
+        </w:rPr>
+        <w:t xml:space="preserve">Analytics (views + RPC)</w:t>
       </w:r>
     </w:p>
     <w:p>
@@ -4044,7 +4916,47 @@
           <w:sz w:val="18"/>
           <w:szCs w:val="18"/>
         </w:rPr>
-        <w:t xml:space="preserve">{ "cost": 0.30, "delay": 0.25, "fund": 0.20, "duplicate": 0.15, "compliance": 0.10 }</w:t>
+        <w:t xml:space="preserve">supabase.from('v_analytics_state').select('*')</w:t>
+      </w:r>
+      <w:r>
+        <w:rPr>
+          <w:rFonts w:ascii="Consolas" w:cs="Consolas" w:eastAsia="Consolas" w:hAnsi="Consolas"/>
+          <w:color w:val="333333"/>
+          <w:sz w:val="18"/>
+          <w:szCs w:val="18"/>
+        </w:rPr>
+        <w:br/>
+        <w:t xml:space="preserve">supabase.from('v_analytics_district').select('*').eq('state_id', stateId)</w:t>
+      </w:r>
+      <w:r>
+        <w:rPr>
+          <w:rFonts w:ascii="Consolas" w:cs="Consolas" w:eastAsia="Consolas" w:hAnsi="Consolas"/>
+          <w:color w:val="333333"/>
+          <w:sz w:val="18"/>
+          <w:szCs w:val="18"/>
+        </w:rPr>
+        <w:br/>
+        <w:t xml:space="preserve">supabase.from('v_analytics_mp').select('*').eq('mp_id', mpId)</w:t>
+      </w:r>
+      <w:r>
+        <w:rPr>
+          <w:rFonts w:ascii="Consolas" w:cs="Consolas" w:eastAsia="Consolas" w:hAnsi="Consolas"/>
+          <w:color w:val="333333"/>
+          <w:sz w:val="18"/>
+          <w:szCs w:val="18"/>
+        </w:rPr>
+        <w:br/>
+        <w:t xml:space="preserve">supabase.from('v_analytics_agency').select('*')</w:t>
+      </w:r>
+      <w:r>
+        <w:rPr>
+          <w:rFonts w:ascii="Consolas" w:cs="Consolas" w:eastAsia="Consolas" w:hAnsi="Consolas"/>
+          <w:color w:val="333333"/>
+          <w:sz w:val="18"/>
+          <w:szCs w:val="18"/>
+        </w:rPr>
+        <w:br/>
+        <w:t xml:space="preserve">supabase.rpc('get_analytics_by_financial_year', { p_year: fy })</w:t>
       </w:r>
     </w:p>
     <w:p>
@@ -4052,92 +4964,7 @@
         <w:spacing w:after="120"/>
       </w:pPr>
       <w:r>
-        <w:t xml:space="preserve">Role-gated. Every PUT writes to audit_log.</w:t>
-      </w:r>
-    </w:p>
-    <w:p>
-      <w:pPr>
-        <w:pStyle w:val="Heading3"/>
-        <w:spacing w:after="100" w:before="200"/>
-      </w:pPr>
-      <w:r>
-        <w:rPr>
-          <w:b/>
-          <w:bCs/>
-          <w:color w:val="1F3864"/>
-          <w:sz w:val="22"/>
-          <w:szCs w:val="22"/>
-        </w:rPr>
-        <w:t xml:space="preserve">Analytics</w:t>
-      </w:r>
-    </w:p>
-    <w:p>
-      <w:pPr>
-        <w:pBdr>
-          <w:top w:val="single" w:color="CCCCCC" w:sz="2"/>
-          <w:bottom w:val="single" w:color="CCCCCC" w:sz="2"/>
-          <w:left w:val="single" w:color="CCCCCC" w:sz="2"/>
-          <w:right w:val="single" w:color="CCCCCC" w:sz="2"/>
-        </w:pBdr>
-        <w:shd w:fill="F5F5F5" w:val="clear"/>
-        <w:spacing w:after="160"/>
-      </w:pPr>
-      <w:r>
-        <w:rPr>
-          <w:rFonts w:ascii="Consolas" w:cs="Consolas" w:eastAsia="Consolas" w:hAnsi="Consolas"/>
-          <w:color w:val="333333"/>
-          <w:sz w:val="18"/>
-          <w:szCs w:val="18"/>
-        </w:rPr>
-        <w:t xml:space="preserve">GET /analytics/state</w:t>
-      </w:r>
-      <w:r>
-        <w:rPr>
-          <w:rFonts w:ascii="Consolas" w:cs="Consolas" w:eastAsia="Consolas" w:hAnsi="Consolas"/>
-          <w:color w:val="333333"/>
-          <w:sz w:val="18"/>
-          <w:szCs w:val="18"/>
-        </w:rPr>
-        <w:br/>
-        <w:t xml:space="preserve">GET /analytics/district</w:t>
-      </w:r>
-      <w:r>
-        <w:rPr>
-          <w:rFonts w:ascii="Consolas" w:cs="Consolas" w:eastAsia="Consolas" w:hAnsi="Consolas"/>
-          <w:color w:val="333333"/>
-          <w:sz w:val="18"/>
-          <w:szCs w:val="18"/>
-        </w:rPr>
-        <w:br/>
-        <w:t xml:space="preserve">GET /analytics/mp</w:t>
-      </w:r>
-      <w:r>
-        <w:rPr>
-          <w:rFonts w:ascii="Consolas" w:cs="Consolas" w:eastAsia="Consolas" w:hAnsi="Consolas"/>
-          <w:color w:val="333333"/>
-          <w:sz w:val="18"/>
-          <w:szCs w:val="18"/>
-        </w:rPr>
-        <w:br/>
-        <w:t xml:space="preserve">GET /analytics/agency</w:t>
-      </w:r>
-      <w:r>
-        <w:rPr>
-          <w:rFonts w:ascii="Consolas" w:cs="Consolas" w:eastAsia="Consolas" w:hAnsi="Consolas"/>
-          <w:color w:val="333333"/>
-          <w:sz w:val="18"/>
-          <w:szCs w:val="18"/>
-        </w:rPr>
-        <w:br/>
-        <w:t xml:space="preserve">GET /analytics/financial-year</w:t>
-      </w:r>
-    </w:p>
-    <w:p>
-      <w:pPr>
-        <w:spacing w:after="120"/>
-      </w:pPr>
-      <w:r>
-        <w:t xml:space="preserve">Each supports aggregation: total works, completed, ongoing, delayed, high-risk, average delay, completion rate, fund utilization, average risk — at work, agency, district, state, MP, financial-year, and work-category levels.</w:t>
+        <w:t xml:space="preserve">Each supports aggregation: total works, completed, ongoing, delayed, high-risk, average delay, completion rate, fund utilization, average risk — at work, agency, district, state, MP, financial-year, and work-category levels. Implemented as Postgres views (materialized where volume requires it) rather than application-layer aggregation code.</w:t>
       </w:r>
     </w:p>
     <w:p>
@@ -4220,7 +5047,7 @@
                 <w:sz w:val="19"/>
                 <w:szCs w:val="19"/>
               </w:rPr>
-              <w:t xml:space="preserve">Backend Source</w:t>
+              <w:t xml:space="preserve">Supabase Source</w:t>
             </w:r>
           </w:p>
         </w:tc>
@@ -4268,7 +5095,7 @@
                 <w:sz w:val="19"/>
                 <w:szCs w:val="19"/>
               </w:rPr>
-              <w:t xml:space="preserve">/analytics/*, /works, /inspections/priority</w:t>
+              <w:t xml:space="preserve">v_analytics_*, works, get_inspection_priority()</w:t>
             </w:r>
           </w:p>
         </w:tc>
@@ -4318,7 +5145,7 @@
                 <w:sz w:val="19"/>
                 <w:szCs w:val="19"/>
               </w:rPr>
-              <w:t xml:space="preserve">/works</w:t>
+              <w:t xml:space="preserve">works (PostgREST, filtered)</w:t>
             </w:r>
           </w:p>
         </w:tc>
@@ -4366,7 +5193,7 @@
                 <w:sz w:val="19"/>
                 <w:szCs w:val="19"/>
               </w:rPr>
-              <w:t xml:space="preserve">/works/{id}</w:t>
+              <w:t xml:space="preserve">work-detail Edge Function (composite)</w:t>
             </w:r>
           </w:p>
         </w:tc>
@@ -4416,7 +5243,7 @@
                 <w:sz w:val="19"/>
                 <w:szCs w:val="19"/>
               </w:rPr>
-              <w:t xml:space="preserve">/works/{id}/risk</w:t>
+              <w:t xml:space="preserve">risk_scores</w:t>
             </w:r>
           </w:p>
         </w:tc>
@@ -4464,7 +5291,7 @@
                 <w:sz w:val="19"/>
                 <w:szCs w:val="19"/>
               </w:rPr>
-              <w:t xml:space="preserve">reason_codes from risk</w:t>
+              <w:t xml:space="preserve">risk_scores.reason_codes</w:t>
             </w:r>
           </w:p>
         </w:tc>
@@ -4514,7 +5341,7 @@
                 <w:sz w:val="19"/>
                 <w:szCs w:val="19"/>
               </w:rPr>
-              <w:t xml:space="preserve">/works/{id}/lifecycle</w:t>
+              <w:t xml:space="preserve">get_work_lifecycle() RPC</w:t>
             </w:r>
           </w:p>
         </w:tc>
@@ -4562,7 +5389,7 @@
                 <w:sz w:val="19"/>
                 <w:szCs w:val="19"/>
               </w:rPr>
-              <w:t xml:space="preserve">/works/{id}/fund-flow</w:t>
+              <w:t xml:space="preserve">fund_releases + fund_anomalies</w:t>
             </w:r>
           </w:p>
         </w:tc>
@@ -4612,7 +5439,7 @@
                 <w:sz w:val="19"/>
                 <w:szCs w:val="19"/>
               </w:rPr>
-              <w:t xml:space="preserve">/duplicates/{id}</w:t>
+              <w:t xml:space="preserve">duplicate_candidates</w:t>
             </w:r>
           </w:p>
         </w:tc>
@@ -4660,7 +5487,7 @@
                 <w:sz w:val="19"/>
                 <w:szCs w:val="19"/>
               </w:rPr>
-              <w:t xml:space="preserve">/compliance/*</w:t>
+              <w:t xml:space="preserve">compliance_flags + compliance_rules</w:t>
             </w:r>
           </w:p>
         </w:tc>
@@ -4710,7 +5537,7 @@
                 <w:sz w:val="19"/>
                 <w:szCs w:val="19"/>
               </w:rPr>
-              <w:t xml:space="preserve">/inspections/priority</w:t>
+              <w:t xml:space="preserve">get_inspection_priority() RPC</w:t>
             </w:r>
           </w:p>
         </w:tc>
@@ -4758,7 +5585,7 @@
                 <w:sz w:val="19"/>
                 <w:szCs w:val="19"/>
               </w:rPr>
-              <w:t xml:space="preserve">/inspections/{id}</w:t>
+              <w:t xml:space="preserve">inspections + review-decision Edge Function</w:t>
             </w:r>
           </w:p>
         </w:tc>
@@ -4808,7 +5635,7 @@
                 <w:sz w:val="19"/>
                 <w:szCs w:val="19"/>
               </w:rPr>
-              <w:t xml:space="preserve">/analytics/agency</w:t>
+              <w:t xml:space="preserve">v_analytics_agency</w:t>
             </w:r>
           </w:p>
         </w:tc>
@@ -4856,7 +5683,7 @@
                 <w:sz w:val="19"/>
                 <w:szCs w:val="19"/>
               </w:rPr>
-              <w:t xml:space="preserve">/analytics/mp</w:t>
+              <w:t xml:space="preserve">v_analytics_mp</w:t>
             </w:r>
           </w:p>
         </w:tc>
@@ -4906,7 +5733,7 @@
                 <w:sz w:val="19"/>
                 <w:szCs w:val="19"/>
               </w:rPr>
-              <w:t xml:space="preserve">/analytics/district, /analytics/state</w:t>
+              <w:t xml:space="preserve">v_analytics_district, v_analytics_state</w:t>
             </w:r>
           </w:p>
         </w:tc>
@@ -4954,7 +5781,7 @@
                 <w:sz w:val="19"/>
                 <w:szCs w:val="19"/>
               </w:rPr>
-              <w:t xml:space="preserve">/data-quality/summary</w:t>
+              <w:t xml:space="preserve">get_data_quality_summary() RPC</w:t>
             </w:r>
           </w:p>
         </w:tc>
@@ -5004,7 +5831,7 @@
                 <w:sz w:val="19"/>
                 <w:szCs w:val="19"/>
               </w:rPr>
-              <w:t xml:space="preserve">/audit-log</w:t>
+              <w:t xml:space="preserve">audit_log (PostgREST)</w:t>
             </w:r>
           </w:p>
         </w:tc>
@@ -5052,7 +5879,7 @@
                 <w:sz w:val="19"/>
                 <w:szCs w:val="19"/>
               </w:rPr>
-              <w:t xml:space="preserve">/settings/risk-weights</w:t>
+              <w:t xml:space="preserve">risk-weights-update Edge Function</w:t>
             </w:r>
           </w:p>
         </w:tc>
@@ -5079,7 +5906,7 @@
         <w:spacing w:after="120"/>
       </w:pPr>
       <w:r>
-        <w:t xml:space="preserve">The frontend should be able to load Work Detail with one primary request rather than seven sequential calls:</w:t>
+        <w:t xml:space="preserve">The frontend loads Work Detail with one call rather than seven sequential PostgREST requests — implemented as an Edge Function that composes the response server-side:</w:t>
       </w:r>
     </w:p>
     <w:p>
@@ -5100,7 +5927,7 @@
           <w:sz w:val="18"/>
           <w:szCs w:val="18"/>
         </w:rPr>
-        <w:t xml:space="preserve">GET /works/{workId}</w:t>
+        <w:t xml:space="preserve">supabase.functions.invoke('work-detail', { body: { workId } })</w:t>
       </w:r>
     </w:p>
     <w:p>
@@ -5166,7 +5993,7 @@
           <w:sz w:val="20"/>
           <w:szCs w:val="20"/>
         </w:rPr>
-        <w:t xml:space="preserve">The backend may fetch these internally from separate services/repositories; the frontend consumes one composed response.</w:t>
+        <w:t xml:space="preserve">Internally the function issues parallel Postgres queries (still RLS-scoped, using the caller's JWT forwarded to the function) and merges them into one JSON payload before returning.</w:t>
       </w:r>
     </w:p>
     <w:p>
@@ -5182,7 +6009,7 @@
           <w:sz w:val="30"/>
           <w:szCs w:val="30"/>
         </w:rPr>
-        <w:t xml:space="preserve">14. Python ↔ Spring Boot Communication</w:t>
+        <w:t xml:space="preserve">14. Python ↔ Supabase Communication</w:t>
       </w:r>
     </w:p>
     <w:p>
@@ -5190,7 +6017,7 @@
         <w:spacing w:after="120"/>
       </w:pPr>
       <w:r>
-        <w:t xml:space="preserve">The React frontend never talks to Python directly.</w:t>
+        <w:t xml:space="preserve">The React frontend never talks to Python directly, and Python never talks to the frontend directly.</w:t>
       </w:r>
     </w:p>
     <w:p>
@@ -5211,27 +6038,99 @@
           <w:sz w:val="18"/>
           <w:szCs w:val="18"/>
         </w:rPr>
-        <w:t xml:space="preserve">React -&gt; Spring Boot API -&gt; PostgreSQL</w:t>
-      </w:r>
-      <w:r>
-        <w:rPr>
-          <w:rFonts w:ascii="Consolas" w:cs="Consolas" w:eastAsia="Consolas" w:hAnsi="Consolas"/>
-          <w:color w:val="333333"/>
-          <w:sz w:val="18"/>
-          <w:szCs w:val="18"/>
-        </w:rPr>
-        <w:br/>
-        <w:t xml:space="preserve">                        -&gt; Python ML (internal service / batch)</w:t>
-      </w:r>
-      <w:r>
-        <w:rPr>
-          <w:rFonts w:ascii="Consolas" w:cs="Consolas" w:eastAsia="Consolas" w:hAnsi="Consolas"/>
-          <w:color w:val="333333"/>
-          <w:sz w:val="18"/>
-          <w:szCs w:val="18"/>
-        </w:rPr>
-        <w:br/>
-        <w:t xml:space="preserve">                              -&gt; ML Results -&gt; PostgreSQL</w:t>
+        <w:t xml:space="preserve">React (supabase-js, anon key, RLS-scoped)</w:t>
+      </w:r>
+      <w:r>
+        <w:rPr>
+          <w:rFonts w:ascii="Consolas" w:cs="Consolas" w:eastAsia="Consolas" w:hAnsi="Consolas"/>
+          <w:color w:val="333333"/>
+          <w:sz w:val="18"/>
+          <w:szCs w:val="18"/>
+        </w:rPr>
+        <w:br/>
+        <w:t xml:space="preserve">        |</w:t>
+      </w:r>
+      <w:r>
+        <w:rPr>
+          <w:rFonts w:ascii="Consolas" w:cs="Consolas" w:eastAsia="Consolas" w:hAnsi="Consolas"/>
+          <w:color w:val="333333"/>
+          <w:sz w:val="18"/>
+          <w:szCs w:val="18"/>
+        </w:rPr>
+        <w:br/>
+        <w:t xml:space="preserve">        v</w:t>
+      </w:r>
+      <w:r>
+        <w:rPr>
+          <w:rFonts w:ascii="Consolas" w:cs="Consolas" w:eastAsia="Consolas" w:hAnsi="Consolas"/>
+          <w:color w:val="333333"/>
+          <w:sz w:val="18"/>
+          <w:szCs w:val="18"/>
+        </w:rPr>
+        <w:br/>
+        <w:t xml:space="preserve">Supabase (PostgREST / RPC / Edge Functions / Auth / RLS)</w:t>
+      </w:r>
+      <w:r>
+        <w:rPr>
+          <w:rFonts w:ascii="Consolas" w:cs="Consolas" w:eastAsia="Consolas" w:hAnsi="Consolas"/>
+          <w:color w:val="333333"/>
+          <w:sz w:val="18"/>
+          <w:szCs w:val="18"/>
+        </w:rPr>
+        <w:br/>
+        <w:t xml:space="preserve">        ^</w:t>
+      </w:r>
+      <w:r>
+        <w:rPr>
+          <w:rFonts w:ascii="Consolas" w:cs="Consolas" w:eastAsia="Consolas" w:hAnsi="Consolas"/>
+          <w:color w:val="333333"/>
+          <w:sz w:val="18"/>
+          <w:szCs w:val="18"/>
+        </w:rPr>
+        <w:br/>
+        <w:t xml:space="preserve">        |  service-role key (server-side only)</w:t>
+      </w:r>
+      <w:r>
+        <w:rPr>
+          <w:rFonts w:ascii="Consolas" w:cs="Consolas" w:eastAsia="Consolas" w:hAnsi="Consolas"/>
+          <w:color w:val="333333"/>
+          <w:sz w:val="18"/>
+          <w:szCs w:val="18"/>
+        </w:rPr>
+        <w:br/>
+        <w:t xml:space="preserve">        |</w:t>
+      </w:r>
+      <w:r>
+        <w:rPr>
+          <w:rFonts w:ascii="Consolas" w:cs="Consolas" w:eastAsia="Consolas" w:hAnsi="Consolas"/>
+          <w:color w:val="333333"/>
+          <w:sz w:val="18"/>
+          <w:szCs w:val="18"/>
+        </w:rPr>
+        <w:br/>
+        <w:t xml:space="preserve">Python ML batch job (ingestion, features, 5 engines, risk scoring)</w:t>
+      </w:r>
+    </w:p>
+    <w:p>
+      <w:pPr>
+        <w:pBdr>
+          <w:top w:val="single" w:color="B00020" w:sz="4"/>
+          <w:bottom w:val="single" w:color="B00020" w:sz="4"/>
+          <w:left w:val="single" w:color="B00020" w:sz="4"/>
+          <w:right w:val="single" w:color="B00020" w:sz="4"/>
+        </w:pBdr>
+        <w:shd w:fill="FDECEC" w:val="clear"/>
+        <w:spacing w:after="200" w:before="100"/>
+      </w:pPr>
+      <w:r>
+        <w:rPr>
+          <w:b/>
+          <w:bCs/>
+          <w:color w:val="7A0016"/>
+          <w:sz w:val="20"/>
+          <w:szCs w:val="20"/>
+        </w:rPr>
+        <w:t xml:space="preserve">⚠  The service-role key bypasses RLS entirely. It must live only in the Python batch environment's secrets/environment variables — never in the React app, never committed to the repository, never used in an Edge Function that accepts client input without its own role check.</w:t>
       </w:r>
     </w:p>
     <w:p>
@@ -5239,7 +6138,7 @@
         <w:spacing w:after="120"/>
       </w:pPr>
       <w:r>
-        <w:t xml:space="preserve">For the hackathon, Python can run as a batch process or an internal-only service (e.g. POST /ml/analyze/{workId}) — never exposed as a public frontend endpoint.</w:t>
+        <w:t xml:space="preserve">For the hackathon, Python can run as a scheduled batch job (cron) that connects with the service-role key and upserts into works/detection_results/risk_scores directly, or be invoked on demand via an internal-only Edge Function (e.g. trigger-ml-run) that is itself role-gated to admin users and never exposed as a public write path.</w:t>
       </w:r>
     </w:p>
     <w:p>
@@ -5370,7 +6269,7 @@
                 <w:sz w:val="19"/>
                 <w:szCs w:val="19"/>
               </w:rPr>
-              <w:t xml:space="preserve">PostgreSQL → Work model → User model → Spring Boot → Spring Security</w:t>
+              <w:t xml:space="preserve">Supabase project → migrations (works, profiles, RLS skeleton) → Supabase Auth</w:t>
             </w:r>
           </w:p>
         </w:tc>
@@ -5420,7 +6319,7 @@
                 <w:sz w:val="19"/>
                 <w:szCs w:val="19"/>
               </w:rPr>
-              <w:t xml:space="preserve">CSV → Python ingestion → cleaning → PostgreSQL</w:t>
+              <w:t xml:space="preserve">CSV → Python ingestion → cleaning → service-role upsert into Supabase Postgres</w:t>
             </w:r>
           </w:p>
         </w:tc>
@@ -5468,7 +6367,7 @@
                 <w:sz w:val="19"/>
                 <w:szCs w:val="19"/>
               </w:rPr>
-              <w:t xml:space="preserve">Cost, Delay, Duplicate, Fund Flow, Compliance</w:t>
+              <w:t xml:space="preserve">Cost, Delay, Duplicate, Fund Flow, Compliance engines writing to detection_results</w:t>
             </w:r>
           </w:p>
         </w:tc>
@@ -5518,7 +6417,7 @@
                 <w:sz w:val="19"/>
                 <w:szCs w:val="19"/>
               </w:rPr>
-              <w:t xml:space="preserve">Detection Results → Risk → Impact → Priority → Reason Codes</w:t>
+              <w:t xml:space="preserve">detection_results → Risk → Impact → Priority → reason_codes into risk_scores</w:t>
             </w:r>
           </w:p>
         </w:tc>
@@ -5543,7 +6442,7 @@
                 <w:sz w:val="19"/>
                 <w:szCs w:val="19"/>
               </w:rPr>
-              <w:t xml:space="preserve">5 — Operations</w:t>
+              <w:t xml:space="preserve">5 — RLS &amp; Policies</w:t>
             </w:r>
           </w:p>
         </w:tc>
@@ -5566,7 +6465,7 @@
                 <w:sz w:val="19"/>
                 <w:szCs w:val="19"/>
               </w:rPr>
-              <w:t xml:space="preserve">Inspection Queue → Review → Decision → Audit</w:t>
+              <w:t xml:space="preserve">Enable RLS on every table; write and test policies per role</w:t>
             </w:r>
           </w:p>
         </w:tc>
@@ -5592,7 +6491,7 @@
                 <w:sz w:val="19"/>
                 <w:szCs w:val="19"/>
               </w:rPr>
-              <w:t xml:space="preserve">6 — Frontend</w:t>
+              <w:t xml:space="preserve">6 — Operations</w:t>
             </w:r>
           </w:p>
         </w:tc>
@@ -5616,7 +6515,105 @@
                 <w:sz w:val="19"/>
                 <w:szCs w:val="19"/>
               </w:rPr>
-              <w:t xml:space="preserve">Dashboard → Works → Work Detail → Inspection → Review</w:t>
+              <w:t xml:space="preserve">Inspection Queue → Review → Decision → audit_log triggers</w:t>
+            </w:r>
+          </w:p>
+        </w:tc>
+      </w:tr>
+      <w:tr>
+        <w:tc>
+          <w:tcPr>
+            <w:tcW w:type="dxa" w:w="2600"/>
+            <w:tcMar>
+              <w:top w:type="dxa" w:w="80"/>
+              <w:left w:type="dxa" w:w="100"/>
+              <w:bottom w:type="dxa" w:w="80"/>
+              <w:right w:type="dxa" w:w="100"/>
+            </w:tcMar>
+          </w:tcPr>
+          <w:p>
+            <w:r>
+              <w:rPr>
+                <w:b w:val="false"/>
+                <w:bCs w:val="false"/>
+                <w:color w:val="222222"/>
+                <w:sz w:val="19"/>
+                <w:szCs w:val="19"/>
+              </w:rPr>
+              <w:t xml:space="preserve">7 — Edge Functions</w:t>
+            </w:r>
+          </w:p>
+        </w:tc>
+        <w:tc>
+          <w:tcPr>
+            <w:tcW w:type="dxa" w:w="7300"/>
+            <w:tcMar>
+              <w:top w:type="dxa" w:w="80"/>
+              <w:left w:type="dxa" w:w="100"/>
+              <w:bottom w:type="dxa" w:w="80"/>
+              <w:right w:type="dxa" w:w="100"/>
+            </w:tcMar>
+          </w:tcPr>
+          <w:p>
+            <w:r>
+              <w:rPr>
+                <w:b w:val="false"/>
+                <w:bCs w:val="false"/>
+                <w:color w:val="222222"/>
+                <w:sz w:val="19"/>
+                <w:szCs w:val="19"/>
+              </w:rPr>
+              <w:t xml:space="preserve">work-detail, get_inspection_priority, risk-weights-update, review-decision</w:t>
+            </w:r>
+          </w:p>
+        </w:tc>
+      </w:tr>
+      <w:tr>
+        <w:tc>
+          <w:tcPr>
+            <w:tcW w:type="dxa" w:w="2600"/>
+            <w:shd w:fill="EDF1F7" w:val="clear"/>
+            <w:tcMar>
+              <w:top w:type="dxa" w:w="80"/>
+              <w:left w:type="dxa" w:w="100"/>
+              <w:bottom w:type="dxa" w:w="80"/>
+              <w:right w:type="dxa" w:w="100"/>
+            </w:tcMar>
+          </w:tcPr>
+          <w:p>
+            <w:r>
+              <w:rPr>
+                <w:b w:val="false"/>
+                <w:bCs w:val="false"/>
+                <w:color w:val="222222"/>
+                <w:sz w:val="19"/>
+                <w:szCs w:val="19"/>
+              </w:rPr>
+              <w:t xml:space="preserve">8 — Frontend</w:t>
+            </w:r>
+          </w:p>
+        </w:tc>
+        <w:tc>
+          <w:tcPr>
+            <w:tcW w:type="dxa" w:w="7300"/>
+            <w:shd w:fill="EDF1F7" w:val="clear"/>
+            <w:tcMar>
+              <w:top w:type="dxa" w:w="80"/>
+              <w:left w:type="dxa" w:w="100"/>
+              <w:bottom w:type="dxa" w:w="80"/>
+              <w:right w:type="dxa" w:w="100"/>
+            </w:tcMar>
+          </w:tcPr>
+          <w:p>
+            <w:r>
+              <w:rPr>
+                <w:b w:val="false"/>
+                <w:bCs w:val="false"/>
+                <w:color w:val="222222"/>
+                <w:sz w:val="19"/>
+                <w:szCs w:val="19"/>
+              </w:rPr>
+              <w:t xml:space="preserve">Dashboard → Works → Work Detail → Inspection → Review, wired to supabase-js</w:t>
             </w:r>
           </w:p>
         </w:tc>
@@ -5643,7 +6640,7 @@
         <w:spacing w:after="120"/>
       </w:pPr>
       <w:r>
-        <w:t xml:space="preserve">An earlier preliminary backend draft used “Vendor/Payment Engine.” System Design Rev. 2 names this the Fund-Flow Anomaly Detector, and treats agency-level concentration as a supporting analytic — not a vendor-data module, since vendor ownership and item-level vendor payments are not confirmed available in public MPLADS data.</w:t>
+        <w:t xml:space="preserve">An earlier preliminary backend draft used “Vendor/Payment Engine.” This is the Fund-Flow Anomaly Detector, and agency-level concentration is a supporting analytic — not a vendor-data module, since vendor ownership and item-level vendor payments are not confirmed available in public MPLADS data.</w:t>
       </w:r>
     </w:p>
     <w:tbl>
@@ -5827,7 +6824,7 @@
           <w:sz w:val="30"/>
           <w:szCs w:val="30"/>
         </w:rPr>
-        <w:t xml:space="preserve">17. Backend Folder Structure (Spring Boot)</w:t>
+        <w:t xml:space="preserve">17. Supabase Project Structure — Reference</w:t>
       </w:r>
     </w:p>
     <w:p>
@@ -5848,147 +6845,147 @@
           <w:sz w:val="18"/>
           <w:szCs w:val="18"/>
         </w:rPr>
-        <w:t xml:space="preserve">src/main/java/com/mplads/intelligence/</w:t>
-      </w:r>
-      <w:r>
-        <w:rPr>
-          <w:rFonts w:ascii="Consolas" w:cs="Consolas" w:eastAsia="Consolas" w:hAnsi="Consolas"/>
-          <w:color w:val="333333"/>
-          <w:sz w:val="18"/>
-          <w:szCs w:val="18"/>
-        </w:rPr>
-        <w:br/>
-        <w:t xml:space="preserve">  config/       SecurityConfig.java, CorsConfig.java</w:t>
-      </w:r>
-      <w:r>
-        <w:rPr>
-          <w:rFonts w:ascii="Consolas" w:cs="Consolas" w:eastAsia="Consolas" w:hAnsi="Consolas"/>
-          <w:color w:val="333333"/>
-          <w:sz w:val="18"/>
-          <w:szCs w:val="18"/>
-        </w:rPr>
-        <w:br/>
-        <w:t xml:space="preserve">  auth/         AuthController, AuthService, JwtService</w:t>
-      </w:r>
-      <w:r>
-        <w:rPr>
-          <w:rFonts w:ascii="Consolas" w:cs="Consolas" w:eastAsia="Consolas" w:hAnsi="Consolas"/>
-          <w:color w:val="333333"/>
-          <w:sz w:val="18"/>
-          <w:szCs w:val="18"/>
-        </w:rPr>
-        <w:br/>
-        <w:t xml:space="preserve">  user/         User, UserRepository, UserService</w:t>
-      </w:r>
-      <w:r>
-        <w:rPr>
-          <w:rFonts w:ascii="Consolas" w:cs="Consolas" w:eastAsia="Consolas" w:hAnsi="Consolas"/>
-          <w:color w:val="333333"/>
-          <w:sz w:val="18"/>
-          <w:szCs w:val="18"/>
-        </w:rPr>
-        <w:br/>
-        <w:t xml:space="preserve">  work/         Work, WorkController, WorkService, WorkRepository</w:t>
-      </w:r>
-      <w:r>
-        <w:rPr>
-          <w:rFonts w:ascii="Consolas" w:cs="Consolas" w:eastAsia="Consolas" w:hAnsi="Consolas"/>
-          <w:color w:val="333333"/>
-          <w:sz w:val="18"/>
-          <w:szCs w:val="18"/>
-        </w:rPr>
-        <w:br/>
-        <w:t xml:space="preserve">  risk/         RiskScore, RiskController, RiskService</w:t>
-      </w:r>
-      <w:r>
-        <w:rPr>
-          <w:rFonts w:ascii="Consolas" w:cs="Consolas" w:eastAsia="Consolas" w:hAnsi="Consolas"/>
-          <w:color w:val="333333"/>
-          <w:sz w:val="18"/>
-          <w:szCs w:val="18"/>
-        </w:rPr>
-        <w:br/>
-        <w:t xml:space="preserve">  compliance/   ComplianceRule, ComplianceFlag, ComplianceController/Service</w:t>
-      </w:r>
-      <w:r>
-        <w:rPr>
-          <w:rFonts w:ascii="Consolas" w:cs="Consolas" w:eastAsia="Consolas" w:hAnsi="Consolas"/>
-          <w:color w:val="333333"/>
-          <w:sz w:val="18"/>
-          <w:szCs w:val="18"/>
-        </w:rPr>
-        <w:br/>
-        <w:t xml:space="preserve">  fundflow/     ...</w:t>
-      </w:r>
-      <w:r>
-        <w:rPr>
-          <w:rFonts w:ascii="Consolas" w:cs="Consolas" w:eastAsia="Consolas" w:hAnsi="Consolas"/>
-          <w:color w:val="333333"/>
-          <w:sz w:val="18"/>
-          <w:szCs w:val="18"/>
-        </w:rPr>
-        <w:br/>
-        <w:t xml:space="preserve">  duplicate/    ...</w:t>
-      </w:r>
-      <w:r>
-        <w:rPr>
-          <w:rFonts w:ascii="Consolas" w:cs="Consolas" w:eastAsia="Consolas" w:hAnsi="Consolas"/>
-          <w:color w:val="333333"/>
-          <w:sz w:val="18"/>
-          <w:szCs w:val="18"/>
-        </w:rPr>
-        <w:br/>
-        <w:t xml:space="preserve">  lifecycle/    ...</w:t>
-      </w:r>
-      <w:r>
-        <w:rPr>
-          <w:rFonts w:ascii="Consolas" w:cs="Consolas" w:eastAsia="Consolas" w:hAnsi="Consolas"/>
-          <w:color w:val="333333"/>
-          <w:sz w:val="18"/>
-          <w:szCs w:val="18"/>
-        </w:rPr>
-        <w:br/>
-        <w:t xml:space="preserve">  inspection/   ...</w:t>
-      </w:r>
-      <w:r>
-        <w:rPr>
-          <w:rFonts w:ascii="Consolas" w:cs="Consolas" w:eastAsia="Consolas" w:hAnsi="Consolas"/>
-          <w:color w:val="333333"/>
-          <w:sz w:val="18"/>
-          <w:szCs w:val="18"/>
-        </w:rPr>
-        <w:br/>
-        <w:t xml:space="preserve">  analytics/    ...</w:t>
-      </w:r>
-      <w:r>
-        <w:rPr>
-          <w:rFonts w:ascii="Consolas" w:cs="Consolas" w:eastAsia="Consolas" w:hAnsi="Consolas"/>
-          <w:color w:val="333333"/>
-          <w:sz w:val="18"/>
-          <w:szCs w:val="18"/>
-        </w:rPr>
-        <w:br/>
-        <w:t xml:space="preserve">  dataquality/  ...</w:t>
-      </w:r>
-      <w:r>
-        <w:rPr>
-          <w:rFonts w:ascii="Consolas" w:cs="Consolas" w:eastAsia="Consolas" w:hAnsi="Consolas"/>
-          <w:color w:val="333333"/>
-          <w:sz w:val="18"/>
-          <w:szCs w:val="18"/>
-        </w:rPr>
-        <w:br/>
-        <w:t xml:space="preserve">  audit/        ...</w:t>
-      </w:r>
-      <w:r>
-        <w:rPr>
-          <w:rFonts w:ascii="Consolas" w:cs="Consolas" w:eastAsia="Consolas" w:hAnsi="Consolas"/>
-          <w:color w:val="333333"/>
-          <w:sz w:val="18"/>
-          <w:szCs w:val="18"/>
-        </w:rPr>
-        <w:br/>
-        <w:t xml:space="preserve">  settings/     ...</w:t>
+        <w:t xml:space="preserve">supabase/</w:t>
+      </w:r>
+      <w:r>
+        <w:rPr>
+          <w:rFonts w:ascii="Consolas" w:cs="Consolas" w:eastAsia="Consolas" w:hAnsi="Consolas"/>
+          <w:color w:val="333333"/>
+          <w:sz w:val="18"/>
+          <w:szCs w:val="18"/>
+        </w:rPr>
+        <w:br/>
+        <w:t xml:space="preserve">  migrations/</w:t>
+      </w:r>
+      <w:r>
+        <w:rPr>
+          <w:rFonts w:ascii="Consolas" w:cs="Consolas" w:eastAsia="Consolas" w:hAnsi="Consolas"/>
+          <w:color w:val="333333"/>
+          <w:sz w:val="18"/>
+          <w:szCs w:val="18"/>
+        </w:rPr>
+        <w:br/>
+        <w:t xml:space="preserve">    0001_init.sql              -- works, fund_releases, work_progress, profiles</w:t>
+      </w:r>
+      <w:r>
+        <w:rPr>
+          <w:rFonts w:ascii="Consolas" w:cs="Consolas" w:eastAsia="Consolas" w:hAnsi="Consolas"/>
+          <w:color w:val="333333"/>
+          <w:sz w:val="18"/>
+          <w:szCs w:val="18"/>
+        </w:rPr>
+        <w:br/>
+        <w:t xml:space="preserve">    0002_detection_and_risk.sql -- detection_results, risk_scores, work_features</w:t>
+      </w:r>
+      <w:r>
+        <w:rPr>
+          <w:rFonts w:ascii="Consolas" w:cs="Consolas" w:eastAsia="Consolas" w:hAnsi="Consolas"/>
+          <w:color w:val="333333"/>
+          <w:sz w:val="18"/>
+          <w:szCs w:val="18"/>
+        </w:rPr>
+        <w:br/>
+        <w:t xml:space="preserve">    0003_compliance_and_fundflow.sql -- compliance_rules/_flags, fund_anomalies, duplicate_candidates</w:t>
+      </w:r>
+      <w:r>
+        <w:rPr>
+          <w:rFonts w:ascii="Consolas" w:cs="Consolas" w:eastAsia="Consolas" w:hAnsi="Consolas"/>
+          <w:color w:val="333333"/>
+          <w:sz w:val="18"/>
+          <w:szCs w:val="18"/>
+        </w:rPr>
+        <w:br/>
+        <w:t xml:space="preserve">    0004_inspections_and_audit.sql   -- inspections, audit_log, triggers</w:t>
+      </w:r>
+      <w:r>
+        <w:rPr>
+          <w:rFonts w:ascii="Consolas" w:cs="Consolas" w:eastAsia="Consolas" w:hAnsi="Consolas"/>
+          <w:color w:val="333333"/>
+          <w:sz w:val="18"/>
+          <w:szCs w:val="18"/>
+        </w:rPr>
+        <w:br/>
+        <w:t xml:space="preserve">    0005_rls_policies.sql       -- RLS enable + policies for every table</w:t>
+      </w:r>
+      <w:r>
+        <w:rPr>
+          <w:rFonts w:ascii="Consolas" w:cs="Consolas" w:eastAsia="Consolas" w:hAnsi="Consolas"/>
+          <w:color w:val="333333"/>
+          <w:sz w:val="18"/>
+          <w:szCs w:val="18"/>
+        </w:rPr>
+        <w:br/>
+        <w:t xml:space="preserve">    0006_analytics_views.sql    -- v_analytics_state/district/mp/agency</w:t>
+      </w:r>
+      <w:r>
+        <w:rPr>
+          <w:rFonts w:ascii="Consolas" w:cs="Consolas" w:eastAsia="Consolas" w:hAnsi="Consolas"/>
+          <w:color w:val="333333"/>
+          <w:sz w:val="18"/>
+          <w:szCs w:val="18"/>
+        </w:rPr>
+        <w:br/>
+        <w:t xml:space="preserve">  functions/</w:t>
+      </w:r>
+      <w:r>
+        <w:rPr>
+          <w:rFonts w:ascii="Consolas" w:cs="Consolas" w:eastAsia="Consolas" w:hAnsi="Consolas"/>
+          <w:color w:val="333333"/>
+          <w:sz w:val="18"/>
+          <w:szCs w:val="18"/>
+        </w:rPr>
+        <w:br/>
+        <w:t xml:space="preserve">    work-detail/index.ts</w:t>
+      </w:r>
+      <w:r>
+        <w:rPr>
+          <w:rFonts w:ascii="Consolas" w:cs="Consolas" w:eastAsia="Consolas" w:hAnsi="Consolas"/>
+          <w:color w:val="333333"/>
+          <w:sz w:val="18"/>
+          <w:szCs w:val="18"/>
+        </w:rPr>
+        <w:br/>
+        <w:t xml:space="preserve">    inspection-priority/index.ts</w:t>
+      </w:r>
+      <w:r>
+        <w:rPr>
+          <w:rFonts w:ascii="Consolas" w:cs="Consolas" w:eastAsia="Consolas" w:hAnsi="Consolas"/>
+          <w:color w:val="333333"/>
+          <w:sz w:val="18"/>
+          <w:szCs w:val="18"/>
+        </w:rPr>
+        <w:br/>
+        <w:t xml:space="preserve">    risk-weights-update/index.ts</w:t>
+      </w:r>
+      <w:r>
+        <w:rPr>
+          <w:rFonts w:ascii="Consolas" w:cs="Consolas" w:eastAsia="Consolas" w:hAnsi="Consolas"/>
+          <w:color w:val="333333"/>
+          <w:sz w:val="18"/>
+          <w:szCs w:val="18"/>
+        </w:rPr>
+        <w:br/>
+        <w:t xml:space="preserve">    review-decision/index.ts</w:t>
+      </w:r>
+      <w:r>
+        <w:rPr>
+          <w:rFonts w:ascii="Consolas" w:cs="Consolas" w:eastAsia="Consolas" w:hAnsi="Consolas"/>
+          <w:color w:val="333333"/>
+          <w:sz w:val="18"/>
+          <w:szCs w:val="18"/>
+        </w:rPr>
+        <w:br/>
+        <w:t xml:space="preserve">    data-quality-summary/index.ts</w:t>
+      </w:r>
+      <w:r>
+        <w:rPr>
+          <w:rFonts w:ascii="Consolas" w:cs="Consolas" w:eastAsia="Consolas" w:hAnsi="Consolas"/>
+          <w:color w:val="333333"/>
+          <w:sz w:val="18"/>
+          <w:szCs w:val="18"/>
+        </w:rPr>
+        <w:br/>
+        <w:t xml:space="preserve">  seed.sql</w:t>
       </w:r>
     </w:p>
     <w:sectPr>

</xml_diff>